<commit_message>
Build guided PSUR authoring and reporting workflows
</commit_message>
<xml_diff>
--- a/controlled_templates/17.3 PSUR TEMPLATE.docx
+++ b/controlled_templates/17.3 PSUR TEMPLATE.docx
@@ -1,6 +1,6 @@
 
 <file path=word/document.xml><?xml version="1.0" encoding="utf-8"?>
-<w:document xmlns:wpc="http://schemas.microsoft.com/office/word/2010/wordprocessingCanvas" xmlns:cx="http://schemas.microsoft.com/office/drawing/2014/chartex" xmlns:cx1="http://schemas.microsoft.com/office/drawing/2015/9/8/chartex" xmlns:cx2="http://schemas.microsoft.com/office/drawing/2015/10/21/chartex" xmlns:cx3="http://schemas.microsoft.com/office/drawing/2016/5/9/chartex" xmlns:cx4="http://schemas.microsoft.com/office/drawing/2016/5/10/chartex" xmlns:cx5="http://schemas.microsoft.com/office/drawing/2016/5/11/chartex" xmlns:cx6="http://schemas.microsoft.com/office/drawing/2016/5/12/chartex" xmlns:cx7="http://schemas.microsoft.com/office/drawing/2016/5/13/chartex" xmlns:cx8="http://schemas.microsoft.com/office/drawing/2016/5/14/chartex" xmlns:mc="http://schemas.openxmlformats.org/markup-compatibility/2006" xmlns:aink="http://schemas.microsoft.com/office/drawing/2016/ink" xmlns:am3d="http://schemas.microsoft.com/office/drawing/2017/model3d" xmlns:o="urn:schemas-microsoft-com:office:office" xmlns:oel="http://schemas.microsoft.com/office/2019/extlst" xmlns:r="http://schemas.openxmlformats.org/officeDocument/2006/relationships" xmlns:m="http://schemas.openxmlformats.org/officeDocument/2006/math" xmlns:v="urn:schemas-microsoft-com:vml" xmlns:wp14="http://schemas.microsoft.com/office/word/2010/wordprocessingDrawing" xmlns:wp="http://schemas.openxmlformats.org/drawingml/2006/wordprocessingDrawing" xmlns:w10="urn:schemas-microsoft-com:office:word" xmlns:w="http://schemas.openxmlformats.org/wordprocessingml/2006/main" xmlns:w14="http://schemas.microsoft.com/office/word/2010/wordml" xmlns:w15="http://schemas.microsoft.com/office/word/2012/wordml" xmlns:w16cex="http://schemas.microsoft.com/office/word/2018/wordml/cex" xmlns:w16cid="http://schemas.microsoft.com/office/word/2016/wordml/cid" xmlns:w16="http://schemas.microsoft.com/office/word/2018/wordml" xmlns:w16du="http://schemas.microsoft.com/office/word/2023/wordml/word16du" xmlns:w16sdtdh="http://schemas.microsoft.com/office/word/2020/wordml/sdtdatahash" xmlns:w16sdtfl="http://schemas.microsoft.com/office/word/2024/wordml/sdtformatlock" xmlns:w16se="http://schemas.microsoft.com/office/word/2015/wordml/symex" xmlns:wpg="http://schemas.microsoft.com/office/word/2010/wordprocessingGroup" xmlns:wpi="http://schemas.microsoft.com/office/word/2010/wordprocessingInk" xmlns:wne="http://schemas.microsoft.com/office/word/2006/wordml" xmlns:wps="http://schemas.microsoft.com/office/word/2010/wordprocessingShape" mc:Ignorable="w14 w15 w16se w16cid w16 w16cex w16sdtdh w16sdtfl w16du wp14">
+<w:document xmlns:wpc="http://schemas.microsoft.com/office/word/2010/wordprocessingCanvas" xmlns:cx="http://schemas.microsoft.com/office/drawing/2014/chartex" xmlns:cx1="http://schemas.microsoft.com/office/drawing/2015/9/8/chartex" xmlns:cx2="http://schemas.microsoft.com/office/drawing/2015/10/21/chartex" xmlns:cx3="http://schemas.microsoft.com/office/drawing/2016/5/9/chartex" xmlns:cx4="http://schemas.microsoft.com/office/drawing/2016/5/10/chartex" xmlns:cx5="http://schemas.microsoft.com/office/drawing/2016/5/11/chartex" xmlns:cx6="http://schemas.microsoft.com/office/drawing/2016/5/12/chartex" xmlns:cx7="http://schemas.microsoft.com/office/drawing/2016/5/13/chartex" xmlns:cx8="http://schemas.microsoft.com/office/drawing/2016/5/14/chartex" xmlns:mc="http://schemas.openxmlformats.org/markup-compatibility/2006" xmlns:aink="http://schemas.microsoft.com/office/drawing/2016/ink" xmlns:am3d="http://schemas.microsoft.com/office/drawing/2017/model3d" xmlns:o="urn:schemas-microsoft-com:office:office" xmlns:oel="http://schemas.microsoft.com/office/2019/extlst" xmlns:r="http://schemas.openxmlformats.org/officeDocument/2006/relationships" xmlns:m="http://schemas.openxmlformats.org/officeDocument/2006/math" xmlns:v="urn:schemas-microsoft-com:vml" xmlns:wp14="http://schemas.microsoft.com/office/word/2010/wordprocessingDrawing" xmlns:wp="http://schemas.openxmlformats.org/drawingml/2006/wordprocessingDrawing" xmlns:w10="urn:schemas-microsoft-com:office:word" xmlns:w="http://schemas.openxmlformats.org/wordprocessingml/2006/main" xmlns:w14="http://schemas.microsoft.com/office/word/2010/wordml" xmlns:w15="http://schemas.microsoft.com/office/word/2012/wordml" xmlns:w16cex="http://schemas.microsoft.com/office/word/2018/wordml/cex" xmlns:w16cid="http://schemas.microsoft.com/office/word/2016/wordml/cid" xmlns:w16="http://schemas.microsoft.com/office/word/2018/wordml" xmlns:w16du="http://schemas.microsoft.com/office/word/2023/wordml/word16du" xmlns:w16sdtdh="http://schemas.microsoft.com/office/word/2020/wordml/sdtdatahash" xmlns:w16se="http://schemas.microsoft.com/office/word/2015/wordml/symex" xmlns:wpg="http://schemas.microsoft.com/office/word/2010/wordprocessingGroup" xmlns:wpi="http://schemas.microsoft.com/office/word/2010/wordprocessingInk" xmlns:wne="http://schemas.microsoft.com/office/word/2006/wordml" xmlns:wps="http://schemas.microsoft.com/office/word/2010/wordprocessingShape" mc:Ignorable="w14 w15 w16se w16cid w16 w16cex w16sdtdh w16du wp14">
   <w:body>
     <w:p>
       <w:pPr>
@@ -37,6 +37,8 @@
         <w:jc w:val="center"/>
         <w:rPr>
           <w:rFonts w:ascii="Times New Roman" w:hAnsi="Times New Roman" w:cs="Times New Roman"/>
+          <w:b/>
+          <w:bCs/>
           <w:sz w:val="24"/>
           <w:szCs w:val="24"/>
         </w:rPr>
@@ -44,6 +46,8 @@
       <w:r>
         <w:rPr>
           <w:rFonts w:ascii="Times New Roman" w:hAnsi="Times New Roman" w:cs="Times New Roman"/>
+          <w:b/>
+          <w:bCs/>
           <w:sz w:val="24"/>
           <w:szCs w:val="24"/>
         </w:rPr>
@@ -52,6 +56,8 @@
       <w:r>
         <w:rPr>
           <w:rFonts w:ascii="Times New Roman" w:hAnsi="Times New Roman" w:cs="Times New Roman"/>
+          <w:b/>
+          <w:bCs/>
           <w:sz w:val="24"/>
           <w:szCs w:val="24"/>
         </w:rPr>
@@ -60,20 +66,12 @@
       <w:r>
         <w:rPr>
           <w:rFonts w:ascii="Times New Roman" w:hAnsi="Times New Roman" w:cs="Times New Roman"/>
+          <w:b/>
+          <w:bCs/>
           <w:sz w:val="24"/>
           <w:szCs w:val="24"/>
         </w:rPr>
         <w:t xml:space="preserve"> </w:t>
-      </w:r>
-      <w:r>
-        <w:rPr>
-          <w:rFonts w:ascii="Times New Roman" w:hAnsi="Times New Roman" w:cs="Times New Roman"/>
-          <w:b/>
-          <w:bCs/>
-          <w:sz w:val="24"/>
-          <w:szCs w:val="24"/>
-        </w:rPr>
-        <w:t>WRITE</w:t>
       </w:r>
     </w:p>
     <w:p>
@@ -94,6 +92,8 @@
       <w:r>
         <w:rPr>
           <w:rFonts w:ascii="Times New Roman" w:hAnsi="Times New Roman" w:cs="Times New Roman"/>
+          <w:b/>
+          <w:bCs/>
           <w:sz w:val="24"/>
           <w:szCs w:val="24"/>
         </w:rPr>
@@ -102,20 +102,12 @@
       <w:r>
         <w:rPr>
           <w:rFonts w:ascii="Times New Roman" w:hAnsi="Times New Roman" w:cs="Times New Roman"/>
+          <w:b/>
+          <w:bCs/>
           <w:sz w:val="24"/>
           <w:szCs w:val="24"/>
         </w:rPr>
         <w:t xml:space="preserve"> </w:t>
-      </w:r>
-      <w:r>
-        <w:rPr>
-          <w:rFonts w:ascii="Times New Roman" w:hAnsi="Times New Roman" w:cs="Times New Roman"/>
-          <w:b/>
-          <w:bCs/>
-          <w:sz w:val="24"/>
-          <w:szCs w:val="24"/>
-        </w:rPr>
-        <w:t>WRITE</w:t>
       </w:r>
     </w:p>
     <w:p>
@@ -502,6 +494,8 @@
       <w:r>
         <w:rPr>
           <w:rFonts w:ascii="Times New Roman" w:hAnsi="Times New Roman" w:cs="Times New Roman"/>
+          <w:b/>
+          <w:bCs/>
           <w:sz w:val="24"/>
           <w:szCs w:val="24"/>
         </w:rPr>
@@ -510,6 +504,8 @@
       <w:r>
         <w:rPr>
           <w:rFonts w:ascii="Times New Roman" w:hAnsi="Times New Roman" w:cs="Times New Roman"/>
+          <w:b/>
+          <w:bCs/>
           <w:sz w:val="24"/>
           <w:szCs w:val="24"/>
         </w:rPr>
@@ -518,6 +514,8 @@
       <w:r>
         <w:rPr>
           <w:rFonts w:ascii="Times New Roman" w:hAnsi="Times New Roman" w:cs="Times New Roman"/>
+          <w:b/>
+          <w:bCs/>
           <w:sz w:val="24"/>
           <w:szCs w:val="24"/>
         </w:rPr>
@@ -526,6 +524,8 @@
       <w:r>
         <w:rPr>
           <w:rFonts w:ascii="Times New Roman" w:hAnsi="Times New Roman" w:cs="Times New Roman"/>
+          <w:b/>
+          <w:bCs/>
           <w:sz w:val="24"/>
           <w:szCs w:val="24"/>
         </w:rPr>
@@ -534,20 +534,12 @@
       <w:r>
         <w:rPr>
           <w:rFonts w:ascii="Times New Roman" w:hAnsi="Times New Roman" w:cs="Times New Roman"/>
+          <w:b/>
+          <w:bCs/>
           <w:sz w:val="24"/>
           <w:szCs w:val="24"/>
         </w:rPr>
         <w:t xml:space="preserve"> </w:t>
-      </w:r>
-      <w:r>
-        <w:rPr>
-          <w:rFonts w:ascii="Times New Roman" w:hAnsi="Times New Roman" w:cs="Times New Roman"/>
-          <w:b/>
-          <w:bCs/>
-          <w:sz w:val="24"/>
-          <w:szCs w:val="24"/>
-        </w:rPr>
-        <w:t>WRITE</w:t>
       </w:r>
     </w:p>
     <w:p>
@@ -567,6 +559,8 @@
       <w:r>
         <w:rPr>
           <w:rFonts w:ascii="Times New Roman" w:hAnsi="Times New Roman" w:cs="Times New Roman"/>
+          <w:b/>
+          <w:bCs/>
           <w:sz w:val="24"/>
           <w:szCs w:val="24"/>
         </w:rPr>
@@ -575,20 +569,12 @@
       <w:r>
         <w:rPr>
           <w:rFonts w:ascii="Times New Roman" w:hAnsi="Times New Roman" w:cs="Times New Roman"/>
+          <w:b/>
+          <w:bCs/>
           <w:sz w:val="24"/>
           <w:szCs w:val="24"/>
         </w:rPr>
         <w:t xml:space="preserve"> BIRTH DATE (IBD): </w:t>
-      </w:r>
-      <w:r>
-        <w:rPr>
-          <w:rFonts w:ascii="Times New Roman" w:hAnsi="Times New Roman" w:cs="Times New Roman"/>
-          <w:b/>
-          <w:bCs/>
-          <w:sz w:val="24"/>
-          <w:szCs w:val="24"/>
-        </w:rPr>
-        <w:t>WRITE</w:t>
       </w:r>
     </w:p>
     <w:p>
@@ -608,20 +594,12 @@
       <w:r>
         <w:rPr>
           <w:rFonts w:ascii="Times New Roman" w:hAnsi="Times New Roman" w:cs="Times New Roman"/>
+          <w:b/>
+          <w:bCs/>
           <w:sz w:val="24"/>
           <w:szCs w:val="24"/>
         </w:rPr>
         <w:t>EUROPEAN UNION REFERENCE DATE (EURD):</w:t>
-      </w:r>
-      <w:r>
-        <w:rPr>
-          <w:rFonts w:ascii="Times New Roman" w:hAnsi="Times New Roman" w:cs="Times New Roman"/>
-          <w:b/>
-          <w:bCs/>
-          <w:sz w:val="24"/>
-          <w:szCs w:val="24"/>
-        </w:rPr>
-        <w:t xml:space="preserve"> WRITE</w:t>
       </w:r>
     </w:p>
     <w:tbl>
@@ -647,6 +625,8 @@
               <w:jc w:val="center"/>
               <w:rPr>
                 <w:rFonts w:ascii="Times New Roman" w:hAnsi="Times New Roman" w:cs="Times New Roman"/>
+                <w:b/>
+                <w:bCs/>
                 <w:sz w:val="24"/>
                 <w:szCs w:val="24"/>
               </w:rPr>
@@ -654,6 +634,8 @@
             <w:r>
               <w:rPr>
                 <w:rFonts w:ascii="Times New Roman" w:hAnsi="Times New Roman" w:cs="Times New Roman"/>
+                <w:b/>
+                <w:bCs/>
                 <w:sz w:val="24"/>
                 <w:szCs w:val="24"/>
               </w:rPr>
@@ -687,7 +669,7 @@
                 <w:sz w:val="24"/>
                 <w:szCs w:val="24"/>
               </w:rPr>
-              <w:t xml:space="preserve"> </w:t>
+              <w:t xml:space="preserve">:   ___  </w:t>
             </w:r>
             <w:r>
               <w:rPr>
@@ -697,16 +679,6 @@
                 <w:sz w:val="24"/>
                 <w:szCs w:val="24"/>
               </w:rPr>
-              <w:t>WRITE</w:t>
-            </w:r>
-            <w:r>
-              <w:rPr>
-                <w:rFonts w:ascii="Times New Roman" w:hAnsi="Times New Roman" w:cs="Times New Roman"/>
-                <w:b/>
-                <w:bCs/>
-                <w:sz w:val="24"/>
-                <w:szCs w:val="24"/>
-              </w:rPr>
               <w:t xml:space="preserve"> </w:t>
             </w:r>
             <w:r>
@@ -715,17 +687,31 @@
                 <w:sz w:val="24"/>
                 <w:szCs w:val="24"/>
               </w:rPr>
-              <w:t xml:space="preserve">to </w:t>
+              <w:t>to</w:t>
             </w:r>
             <w:r>
               <w:rPr>
                 <w:rFonts w:ascii="Times New Roman" w:hAnsi="Times New Roman" w:cs="Times New Roman"/>
-                <w:b/>
-                <w:bCs/>
                 <w:sz w:val="24"/>
                 <w:szCs w:val="24"/>
               </w:rPr>
-              <w:t>WRITE</w:t>
+              <w:t xml:space="preserve">  ____</w:t>
+            </w:r>
+            <w:r>
+              <w:rPr>
+                <w:rFonts w:ascii="Times New Roman" w:hAnsi="Times New Roman" w:cs="Times New Roman"/>
+                <w:sz w:val="24"/>
+                <w:szCs w:val="24"/>
+              </w:rPr>
+              <w:t xml:space="preserve"> </w:t>
+            </w:r>
+            <w:r>
+              <w:rPr>
+                <w:rFonts w:ascii="Times New Roman" w:hAnsi="Times New Roman" w:cs="Times New Roman"/>
+                <w:sz w:val="24"/>
+                <w:szCs w:val="24"/>
+              </w:rPr>
+              <w:t xml:space="preserve">       </w:t>
             </w:r>
           </w:p>
           <w:p>
@@ -751,6 +737,8 @@
               <w:jc w:val="center"/>
               <w:rPr>
                 <w:rFonts w:ascii="Times New Roman" w:hAnsi="Times New Roman" w:cs="Times New Roman"/>
+                <w:b/>
+                <w:bCs/>
                 <w:sz w:val="24"/>
                 <w:szCs w:val="24"/>
               </w:rPr>
@@ -758,6 +746,8 @@
             <w:r>
               <w:rPr>
                 <w:rFonts w:ascii="Times New Roman" w:hAnsi="Times New Roman" w:cs="Times New Roman"/>
+                <w:b/>
+                <w:bCs/>
                 <w:sz w:val="24"/>
                 <w:szCs w:val="24"/>
               </w:rPr>
@@ -766,10 +756,22 @@
             <w:r>
               <w:rPr>
                 <w:rFonts w:ascii="Times New Roman" w:hAnsi="Times New Roman" w:cs="Times New Roman"/>
+                <w:b/>
+                <w:bCs/>
                 <w:sz w:val="24"/>
                 <w:szCs w:val="24"/>
               </w:rPr>
               <w:t>REPORT</w:t>
+            </w:r>
+            <w:r>
+              <w:rPr>
+                <w:rFonts w:ascii="Times New Roman" w:hAnsi="Times New Roman" w:cs="Times New Roman"/>
+                <w:b/>
+                <w:bCs/>
+                <w:sz w:val="24"/>
+                <w:szCs w:val="24"/>
+              </w:rPr>
+              <w:t>:</w:t>
             </w:r>
           </w:p>
           <w:p>
@@ -787,16 +789,6 @@
                 <w:szCs w:val="24"/>
               </w:rPr>
             </w:pPr>
-            <w:r>
-              <w:rPr>
-                <w:rFonts w:ascii="Times New Roman" w:hAnsi="Times New Roman" w:cs="Times New Roman"/>
-                <w:b/>
-                <w:bCs/>
-                <w:sz w:val="24"/>
-                <w:szCs w:val="24"/>
-              </w:rPr>
-              <w:t>WRITE</w:t>
-            </w:r>
           </w:p>
         </w:tc>
       </w:tr>
@@ -839,12 +831,39 @@
           <w:szCs w:val="24"/>
         </w:rPr>
       </w:pPr>
-      <w:r>
+    </w:p>
+    <w:p>
+      <w:pPr>
+        <w:tabs>
+          <w:tab w:val="left" w:pos="3243"/>
+        </w:tabs>
+        <w:spacing w:line="360" w:lineRule="auto"/>
         <w:rPr>
           <w:rFonts w:ascii="Times New Roman" w:hAnsi="Times New Roman" w:cs="Times New Roman"/>
           <w:sz w:val="24"/>
           <w:szCs w:val="24"/>
         </w:rPr>
+      </w:pPr>
+    </w:p>
+    <w:p>
+      <w:pPr>
+        <w:tabs>
+          <w:tab w:val="left" w:pos="3243"/>
+        </w:tabs>
+        <w:spacing w:line="360" w:lineRule="auto"/>
+        <w:rPr>
+          <w:rFonts w:ascii="Times New Roman" w:hAnsi="Times New Roman" w:cs="Times New Roman"/>
+          <w:sz w:val="24"/>
+          <w:szCs w:val="24"/>
+        </w:rPr>
+      </w:pPr>
+      <w:r>
+        <w:rPr>
+          <w:rFonts w:ascii="Times New Roman" w:hAnsi="Times New Roman" w:cs="Times New Roman"/>
+          <w:sz w:val="24"/>
+          <w:szCs w:val="24"/>
+        </w:rPr>
+        <w:lastRenderedPageBreak/>
         <w:t>MARKETING AUTHORISATION HOLDER’S NAME AND ADDRESS:</w:t>
       </w:r>
     </w:p>
@@ -1110,6 +1129,8 @@
         <w:spacing w:line="360" w:lineRule="auto"/>
         <w:rPr>
           <w:rFonts w:ascii="Times New Roman" w:hAnsi="Times New Roman" w:cs="Times New Roman"/>
+          <w:b/>
+          <w:bCs/>
           <w:sz w:val="24"/>
           <w:szCs w:val="24"/>
         </w:rPr>
@@ -1117,6 +1138,8 @@
       <w:r>
         <w:rPr>
           <w:rFonts w:ascii="Times New Roman" w:hAnsi="Times New Roman" w:cs="Times New Roman"/>
+          <w:b/>
+          <w:bCs/>
           <w:sz w:val="24"/>
           <w:szCs w:val="24"/>
         </w:rPr>
@@ -1125,6 +1148,8 @@
       <w:r>
         <w:rPr>
           <w:rFonts w:ascii="Times New Roman" w:hAnsi="Times New Roman" w:cs="Times New Roman"/>
+          <w:b/>
+          <w:bCs/>
           <w:sz w:val="24"/>
           <w:szCs w:val="24"/>
         </w:rPr>
@@ -1133,6 +1158,8 @@
       <w:r>
         <w:rPr>
           <w:rFonts w:ascii="Times New Roman" w:hAnsi="Times New Roman" w:cs="Times New Roman"/>
+          <w:b/>
+          <w:bCs/>
           <w:sz w:val="24"/>
           <w:szCs w:val="24"/>
         </w:rPr>
@@ -1156,22 +1183,14 @@
       <w:r>
         <w:rPr>
           <w:rFonts w:ascii="Times New Roman" w:hAnsi="Times New Roman" w:cs="Times New Roman"/>
+          <w:b/>
+          <w:bCs/>
           <w:sz w:val="24"/>
           <w:szCs w:val="24"/>
         </w:rPr>
         <w:t xml:space="preserve">NAME: </w:t>
       </w:r>
       <w:bookmarkStart w:id="0" w:name="_Hlk229067006"/>
-      <w:r>
-        <w:rPr>
-          <w:rFonts w:ascii="Times New Roman" w:hAnsi="Times New Roman" w:cs="Times New Roman"/>
-          <w:b/>
-          <w:bCs/>
-          <w:sz w:val="24"/>
-          <w:szCs w:val="24"/>
-        </w:rPr>
-        <w:t>WRITE</w:t>
-      </w:r>
     </w:p>
     <w:bookmarkEnd w:id="0"/>
     <w:p>
@@ -1182,6 +1201,8 @@
         <w:spacing w:line="360" w:lineRule="auto"/>
         <w:rPr>
           <w:rFonts w:ascii="Times New Roman" w:hAnsi="Times New Roman" w:cs="Times New Roman"/>
+          <w:b/>
+          <w:bCs/>
           <w:sz w:val="24"/>
           <w:szCs w:val="24"/>
         </w:rPr>
@@ -1189,6 +1210,8 @@
       <w:r>
         <w:rPr>
           <w:rFonts w:ascii="Times New Roman" w:hAnsi="Times New Roman" w:cs="Times New Roman"/>
+          <w:b/>
+          <w:bCs/>
           <w:sz w:val="24"/>
           <w:szCs w:val="24"/>
         </w:rPr>
@@ -1197,6 +1220,8 @@
       <w:r>
         <w:rPr>
           <w:rFonts w:ascii="Times New Roman" w:hAnsi="Times New Roman" w:cs="Times New Roman"/>
+          <w:b/>
+          <w:bCs/>
           <w:sz w:val="24"/>
           <w:szCs w:val="24"/>
         </w:rPr>
@@ -1220,20 +1245,12 @@
       <w:r>
         <w:rPr>
           <w:rFonts w:ascii="Times New Roman" w:hAnsi="Times New Roman" w:cs="Times New Roman"/>
-          <w:sz w:val="24"/>
-          <w:szCs w:val="24"/>
-        </w:rPr>
-        <w:t xml:space="preserve">Phone: </w:t>
-      </w:r>
-      <w:r>
-        <w:rPr>
-          <w:rFonts w:ascii="Times New Roman" w:hAnsi="Times New Roman" w:cs="Times New Roman"/>
           <w:b/>
           <w:bCs/>
           <w:sz w:val="24"/>
           <w:szCs w:val="24"/>
         </w:rPr>
-        <w:t>WRITE</w:t>
+        <w:t>Phone:</w:t>
       </w:r>
     </w:p>
     <w:p>
@@ -1253,20 +1270,12 @@
       <w:r>
         <w:rPr>
           <w:rFonts w:ascii="Times New Roman" w:hAnsi="Times New Roman" w:cs="Times New Roman"/>
+          <w:b/>
+          <w:bCs/>
           <w:sz w:val="24"/>
           <w:szCs w:val="24"/>
         </w:rPr>
         <w:t xml:space="preserve">Email: </w:t>
-      </w:r>
-      <w:r>
-        <w:rPr>
-          <w:rFonts w:ascii="Times New Roman" w:hAnsi="Times New Roman" w:cs="Times New Roman"/>
-          <w:b/>
-          <w:bCs/>
-          <w:sz w:val="24"/>
-          <w:szCs w:val="24"/>
-        </w:rPr>
-        <w:t>write</w:t>
       </w:r>
     </w:p>
     <w:p>
@@ -1441,6 +1450,36 @@
     </w:p>
     <w:p>
       <w:pPr>
+        <w:tabs>
+          <w:tab w:val="left" w:pos="3243"/>
+        </w:tabs>
+        <w:spacing w:line="360" w:lineRule="auto"/>
+        <w:rPr>
+          <w:rFonts w:ascii="Times New Roman" w:hAnsi="Times New Roman" w:cs="Times New Roman"/>
+          <w:b/>
+          <w:bCs/>
+          <w:sz w:val="24"/>
+          <w:szCs w:val="24"/>
+        </w:rPr>
+      </w:pPr>
+    </w:p>
+    <w:p>
+      <w:pPr>
+        <w:tabs>
+          <w:tab w:val="left" w:pos="3243"/>
+        </w:tabs>
+        <w:spacing w:line="360" w:lineRule="auto"/>
+        <w:rPr>
+          <w:rFonts w:ascii="Times New Roman" w:hAnsi="Times New Roman" w:cs="Times New Roman"/>
+          <w:b/>
+          <w:bCs/>
+          <w:sz w:val="24"/>
+          <w:szCs w:val="24"/>
+        </w:rPr>
+      </w:pPr>
+    </w:p>
+    <w:p>
+      <w:pPr>
         <w:spacing w:after="0" w:line="360" w:lineRule="auto"/>
         <w:jc w:val="both"/>
         <w:rPr>
@@ -1472,6 +1511,7 @@
           <w:szCs w:val="24"/>
           <w:lang w:val="en-GB"/>
         </w:rPr>
+        <w:lastRenderedPageBreak/>
         <w:t>Contact person for the PBRER:</w:t>
       </w:r>
       <w:r>
@@ -1492,14 +1532,18 @@
         <w:jc w:val="both"/>
         <w:rPr>
           <w:rFonts w:ascii="Times New Roman" w:eastAsia="Times New Roman" w:hAnsi="Times New Roman" w:cs="Times New Roman"/>
-          <w:sz w:val="24"/>
-          <w:szCs w:val="24"/>
-          <w:lang w:val="en-GB"/>
-        </w:rPr>
-      </w:pPr>
-      <w:r>
-        <w:rPr>
-          <w:rFonts w:ascii="Times New Roman" w:eastAsia="Times New Roman" w:hAnsi="Times New Roman" w:cs="Times New Roman"/>
+          <w:b/>
+          <w:bCs/>
+          <w:sz w:val="24"/>
+          <w:szCs w:val="24"/>
+          <w:lang w:val="en-GB"/>
+        </w:rPr>
+      </w:pPr>
+      <w:r>
+        <w:rPr>
+          <w:rFonts w:ascii="Times New Roman" w:eastAsia="Times New Roman" w:hAnsi="Times New Roman" w:cs="Times New Roman"/>
+          <w:b/>
+          <w:bCs/>
           <w:sz w:val="24"/>
           <w:szCs w:val="24"/>
           <w:lang w:val="en-GB"/>
@@ -1514,14 +1558,18 @@
         <w:jc w:val="both"/>
         <w:rPr>
           <w:rFonts w:ascii="Times New Roman" w:eastAsia="Times New Roman" w:hAnsi="Times New Roman" w:cs="Times New Roman"/>
-          <w:sz w:val="24"/>
-          <w:szCs w:val="24"/>
-          <w:lang w:val="en-GB"/>
-        </w:rPr>
-      </w:pPr>
-      <w:r>
-        <w:rPr>
-          <w:rFonts w:ascii="Times New Roman" w:eastAsia="Times New Roman" w:hAnsi="Times New Roman" w:cs="Times New Roman"/>
+          <w:b/>
+          <w:bCs/>
+          <w:sz w:val="24"/>
+          <w:szCs w:val="24"/>
+          <w:lang w:val="en-GB"/>
+        </w:rPr>
+      </w:pPr>
+      <w:r>
+        <w:rPr>
+          <w:rFonts w:ascii="Times New Roman" w:eastAsia="Times New Roman" w:hAnsi="Times New Roman" w:cs="Times New Roman"/>
+          <w:b/>
+          <w:bCs/>
           <w:sz w:val="24"/>
           <w:szCs w:val="24"/>
           <w:lang w:val="en-GB"/>
@@ -1659,14 +1707,18 @@
         <w:ind w:left="1702" w:firstLine="458"/>
         <w:rPr>
           <w:rFonts w:ascii="Times New Roman" w:eastAsia="Times New Roman" w:hAnsi="Times New Roman" w:cs="Times New Roman"/>
-          <w:sz w:val="24"/>
-          <w:szCs w:val="24"/>
-          <w:lang w:val="en-GB"/>
-        </w:rPr>
-      </w:pPr>
-      <w:r>
-        <w:rPr>
-          <w:rFonts w:ascii="Times New Roman" w:eastAsia="Times New Roman" w:hAnsi="Times New Roman" w:cs="Times New Roman"/>
+          <w:b/>
+          <w:bCs/>
+          <w:sz w:val="24"/>
+          <w:szCs w:val="24"/>
+          <w:lang w:val="en-GB"/>
+        </w:rPr>
+      </w:pPr>
+      <w:r>
+        <w:rPr>
+          <w:rFonts w:ascii="Times New Roman" w:eastAsia="Times New Roman" w:hAnsi="Times New Roman" w:cs="Times New Roman"/>
+          <w:b/>
+          <w:bCs/>
           <w:sz w:val="24"/>
           <w:szCs w:val="24"/>
           <w:lang w:val="en-GB"/>
@@ -1680,14 +1732,18 @@
         <w:ind w:left="2977" w:hanging="850"/>
         <w:rPr>
           <w:rFonts w:ascii="Times New Roman" w:eastAsia="Times New Roman" w:hAnsi="Times New Roman" w:cs="Times New Roman"/>
-          <w:sz w:val="24"/>
-          <w:szCs w:val="24"/>
-          <w:lang w:val="en-GB"/>
-        </w:rPr>
-      </w:pPr>
-      <w:r>
-        <w:rPr>
-          <w:rFonts w:ascii="Times New Roman" w:eastAsia="Times New Roman" w:hAnsi="Times New Roman" w:cs="Times New Roman"/>
+          <w:b/>
+          <w:bCs/>
+          <w:sz w:val="24"/>
+          <w:szCs w:val="24"/>
+          <w:lang w:val="en-GB"/>
+        </w:rPr>
+      </w:pPr>
+      <w:r>
+        <w:rPr>
+          <w:rFonts w:ascii="Times New Roman" w:eastAsia="Times New Roman" w:hAnsi="Times New Roman" w:cs="Times New Roman"/>
+          <w:b/>
+          <w:bCs/>
           <w:sz w:val="24"/>
           <w:szCs w:val="24"/>
           <w:lang w:val="en-GB"/>
@@ -1746,6 +1802,16 @@
           <w:sz w:val="24"/>
           <w:szCs w:val="24"/>
         </w:rPr>
+        <w:t>Name</w:t>
+      </w:r>
+      <w:r>
+        <w:rPr>
+          <w:rFonts w:ascii="Times New Roman" w:hAnsi="Times New Roman" w:cs="Times New Roman"/>
+          <w:b/>
+          <w:bCs/>
+          <w:sz w:val="24"/>
+          <w:szCs w:val="24"/>
+        </w:rPr>
         <w:tab/>
       </w:r>
       <w:r>
@@ -1757,16 +1823,6 @@
           <w:szCs w:val="24"/>
         </w:rPr>
         <w:t xml:space="preserve">: </w:t>
-      </w:r>
-      <w:r>
-        <w:rPr>
-          <w:rFonts w:ascii="Times New Roman" w:hAnsi="Times New Roman" w:cs="Times New Roman"/>
-          <w:b/>
-          <w:bCs/>
-          <w:sz w:val="24"/>
-          <w:szCs w:val="24"/>
-        </w:rPr>
-        <w:t xml:space="preserve">WRITE NAME </w:t>
       </w:r>
     </w:p>
     <w:p>
@@ -1940,6 +1996,7 @@
       <w:bookmarkStart w:id="3" w:name="_Toc174534493"/>
       <w:bookmarkStart w:id="4" w:name="_Toc229124954"/>
       <w:r>
+        <w:lastRenderedPageBreak/>
         <w:t>Executive summary</w:t>
       </w:r>
       <w:bookmarkEnd w:id="1"/>
@@ -1947,7 +2004,7 @@
       <w:bookmarkEnd w:id="3"/>
       <w:bookmarkEnd w:id="4"/>
       <w:r>
-        <w:t xml:space="preserve"> </w:t>
+        <w:t>:</w:t>
       </w:r>
     </w:p>
     <w:p>
@@ -2000,6 +2057,7 @@
         <w:rPr>
           <w:lang w:eastAsia="en-IN"/>
         </w:rPr>
+        <w:lastRenderedPageBreak/>
         <w:t>Mechanism of action:</w:t>
       </w:r>
       <w:bookmarkEnd w:id="7"/>
@@ -2021,11 +2079,362 @@
     </w:p>
     <w:p>
       <w:pPr>
+        <w:keepNext/>
+        <w:keepLines/>
+        <w:spacing w:after="0" w:line="360" w:lineRule="auto"/>
+        <w:jc w:val="both"/>
+        <w:rPr>
+          <w:rFonts w:ascii="Times New Roman" w:eastAsia="Times New Roman" w:hAnsi="Times New Roman" w:cs="Times New Roman"/>
+          <w:b/>
+          <w:sz w:val="24"/>
+          <w:szCs w:val="24"/>
+        </w:rPr>
+      </w:pPr>
+    </w:p>
+    <w:p>
+      <w:pPr>
+        <w:keepNext/>
+        <w:keepLines/>
+        <w:spacing w:after="0" w:line="360" w:lineRule="auto"/>
+        <w:jc w:val="both"/>
+        <w:rPr>
+          <w:rFonts w:ascii="Times New Roman" w:eastAsia="Times New Roman" w:hAnsi="Times New Roman" w:cs="Times New Roman"/>
+          <w:b/>
+          <w:sz w:val="24"/>
+          <w:szCs w:val="24"/>
+        </w:rPr>
+      </w:pPr>
+    </w:p>
+    <w:p>
+      <w:pPr>
+        <w:keepNext/>
+        <w:keepLines/>
+        <w:spacing w:after="0" w:line="360" w:lineRule="auto"/>
+        <w:jc w:val="both"/>
+        <w:rPr>
+          <w:rFonts w:ascii="Times New Roman" w:eastAsia="Times New Roman" w:hAnsi="Times New Roman" w:cs="Times New Roman"/>
+          <w:b/>
+          <w:sz w:val="24"/>
+          <w:szCs w:val="24"/>
+        </w:rPr>
+      </w:pPr>
+    </w:p>
+    <w:p>
+      <w:pPr>
+        <w:keepNext/>
+        <w:keepLines/>
+        <w:spacing w:after="0" w:line="360" w:lineRule="auto"/>
+        <w:jc w:val="both"/>
+        <w:rPr>
+          <w:rFonts w:ascii="Times New Roman" w:eastAsia="Times New Roman" w:hAnsi="Times New Roman" w:cs="Times New Roman"/>
+          <w:b/>
+          <w:sz w:val="24"/>
+          <w:szCs w:val="24"/>
+        </w:rPr>
+      </w:pPr>
+    </w:p>
+    <w:p>
+      <w:pPr>
+        <w:keepNext/>
+        <w:keepLines/>
+        <w:spacing w:after="0" w:line="360" w:lineRule="auto"/>
+        <w:jc w:val="both"/>
+        <w:rPr>
+          <w:rFonts w:ascii="Times New Roman" w:eastAsia="Times New Roman" w:hAnsi="Times New Roman" w:cs="Times New Roman"/>
+          <w:b/>
+          <w:sz w:val="24"/>
+          <w:szCs w:val="24"/>
+        </w:rPr>
+      </w:pPr>
+    </w:p>
+    <w:p>
+      <w:pPr>
+        <w:keepNext/>
+        <w:keepLines/>
+        <w:spacing w:after="0" w:line="360" w:lineRule="auto"/>
+        <w:jc w:val="both"/>
+        <w:rPr>
+          <w:rFonts w:ascii="Times New Roman" w:eastAsia="Times New Roman" w:hAnsi="Times New Roman" w:cs="Times New Roman"/>
+          <w:b/>
+          <w:sz w:val="24"/>
+          <w:szCs w:val="24"/>
+        </w:rPr>
+      </w:pPr>
+    </w:p>
+    <w:p>
+      <w:pPr>
+        <w:keepNext/>
+        <w:keepLines/>
+        <w:spacing w:after="0" w:line="360" w:lineRule="auto"/>
+        <w:jc w:val="both"/>
+        <w:rPr>
+          <w:rFonts w:ascii="Times New Roman" w:eastAsia="Times New Roman" w:hAnsi="Times New Roman" w:cs="Times New Roman"/>
+          <w:b/>
+          <w:sz w:val="24"/>
+          <w:szCs w:val="24"/>
+        </w:rPr>
+      </w:pPr>
+    </w:p>
+    <w:p>
+      <w:pPr>
+        <w:keepNext/>
+        <w:keepLines/>
+        <w:spacing w:after="0" w:line="360" w:lineRule="auto"/>
+        <w:jc w:val="both"/>
+        <w:rPr>
+          <w:rFonts w:ascii="Times New Roman" w:eastAsia="Times New Roman" w:hAnsi="Times New Roman" w:cs="Times New Roman"/>
+          <w:b/>
+          <w:sz w:val="24"/>
+          <w:szCs w:val="24"/>
+        </w:rPr>
+      </w:pPr>
+    </w:p>
+    <w:p>
+      <w:pPr>
+        <w:keepNext/>
+        <w:keepLines/>
+        <w:spacing w:after="0" w:line="360" w:lineRule="auto"/>
+        <w:jc w:val="both"/>
+        <w:rPr>
+          <w:rFonts w:ascii="Times New Roman" w:eastAsia="Times New Roman" w:hAnsi="Times New Roman" w:cs="Times New Roman"/>
+          <w:b/>
+          <w:sz w:val="24"/>
+          <w:szCs w:val="24"/>
+        </w:rPr>
+      </w:pPr>
+    </w:p>
+    <w:p>
+      <w:pPr>
+        <w:keepNext/>
+        <w:keepLines/>
+        <w:spacing w:after="0" w:line="360" w:lineRule="auto"/>
+        <w:jc w:val="both"/>
+        <w:rPr>
+          <w:rFonts w:ascii="Times New Roman" w:eastAsia="Times New Roman" w:hAnsi="Times New Roman" w:cs="Times New Roman"/>
+          <w:b/>
+          <w:sz w:val="24"/>
+          <w:szCs w:val="24"/>
+        </w:rPr>
+      </w:pPr>
+    </w:p>
+    <w:p>
+      <w:pPr>
+        <w:keepNext/>
+        <w:keepLines/>
+        <w:spacing w:after="0" w:line="360" w:lineRule="auto"/>
+        <w:jc w:val="both"/>
+        <w:rPr>
+          <w:rFonts w:ascii="Times New Roman" w:eastAsia="Times New Roman" w:hAnsi="Times New Roman" w:cs="Times New Roman"/>
+          <w:b/>
+          <w:sz w:val="24"/>
+          <w:szCs w:val="24"/>
+        </w:rPr>
+      </w:pPr>
+    </w:p>
+    <w:p>
+      <w:pPr>
+        <w:keepNext/>
+        <w:keepLines/>
+        <w:spacing w:after="0" w:line="360" w:lineRule="auto"/>
+        <w:jc w:val="both"/>
+        <w:rPr>
+          <w:rFonts w:ascii="Times New Roman" w:eastAsia="Times New Roman" w:hAnsi="Times New Roman" w:cs="Times New Roman"/>
+          <w:b/>
+          <w:sz w:val="24"/>
+          <w:szCs w:val="24"/>
+        </w:rPr>
+      </w:pPr>
+    </w:p>
+    <w:p>
+      <w:pPr>
+        <w:keepNext/>
+        <w:keepLines/>
+        <w:spacing w:after="0" w:line="360" w:lineRule="auto"/>
+        <w:jc w:val="both"/>
+        <w:rPr>
+          <w:rFonts w:ascii="Times New Roman" w:eastAsia="Times New Roman" w:hAnsi="Times New Roman" w:cs="Times New Roman"/>
+          <w:b/>
+          <w:sz w:val="24"/>
+          <w:szCs w:val="24"/>
+        </w:rPr>
+      </w:pPr>
+    </w:p>
+    <w:p>
+      <w:pPr>
+        <w:keepNext/>
+        <w:keepLines/>
+        <w:spacing w:after="0" w:line="360" w:lineRule="auto"/>
+        <w:jc w:val="both"/>
+        <w:rPr>
+          <w:rFonts w:ascii="Times New Roman" w:eastAsia="Times New Roman" w:hAnsi="Times New Roman" w:cs="Times New Roman"/>
+          <w:b/>
+          <w:sz w:val="24"/>
+          <w:szCs w:val="24"/>
+        </w:rPr>
+      </w:pPr>
+    </w:p>
+    <w:p>
+      <w:pPr>
+        <w:keepNext/>
+        <w:keepLines/>
+        <w:spacing w:after="0" w:line="360" w:lineRule="auto"/>
+        <w:jc w:val="both"/>
+        <w:rPr>
+          <w:rFonts w:ascii="Times New Roman" w:eastAsia="Times New Roman" w:hAnsi="Times New Roman" w:cs="Times New Roman"/>
+          <w:b/>
+          <w:sz w:val="24"/>
+          <w:szCs w:val="24"/>
+        </w:rPr>
+      </w:pPr>
+    </w:p>
+    <w:p>
+      <w:pPr>
+        <w:keepNext/>
+        <w:keepLines/>
+        <w:spacing w:after="0" w:line="360" w:lineRule="auto"/>
+        <w:jc w:val="both"/>
+        <w:rPr>
+          <w:rFonts w:ascii="Times New Roman" w:eastAsia="Times New Roman" w:hAnsi="Times New Roman" w:cs="Times New Roman"/>
+          <w:b/>
+          <w:sz w:val="24"/>
+          <w:szCs w:val="24"/>
+        </w:rPr>
+      </w:pPr>
+    </w:p>
+    <w:p>
+      <w:pPr>
+        <w:keepNext/>
+        <w:keepLines/>
+        <w:spacing w:after="0" w:line="360" w:lineRule="auto"/>
+        <w:jc w:val="both"/>
+        <w:rPr>
+          <w:rFonts w:ascii="Times New Roman" w:eastAsia="Times New Roman" w:hAnsi="Times New Roman" w:cs="Times New Roman"/>
+          <w:b/>
+          <w:sz w:val="24"/>
+          <w:szCs w:val="24"/>
+        </w:rPr>
+      </w:pPr>
+    </w:p>
+    <w:p>
+      <w:pPr>
+        <w:keepNext/>
+        <w:keepLines/>
+        <w:spacing w:after="0" w:line="360" w:lineRule="auto"/>
+        <w:jc w:val="both"/>
+        <w:rPr>
+          <w:rFonts w:ascii="Times New Roman" w:eastAsia="Times New Roman" w:hAnsi="Times New Roman" w:cs="Times New Roman"/>
+          <w:b/>
+          <w:sz w:val="24"/>
+          <w:szCs w:val="24"/>
+        </w:rPr>
+      </w:pPr>
+    </w:p>
+    <w:p>
+      <w:pPr>
+        <w:keepNext/>
+        <w:keepLines/>
+        <w:spacing w:after="0" w:line="360" w:lineRule="auto"/>
+        <w:jc w:val="both"/>
+        <w:rPr>
+          <w:rFonts w:ascii="Times New Roman" w:eastAsia="Times New Roman" w:hAnsi="Times New Roman" w:cs="Times New Roman"/>
+          <w:b/>
+          <w:sz w:val="24"/>
+          <w:szCs w:val="24"/>
+        </w:rPr>
+      </w:pPr>
+    </w:p>
+    <w:p>
+      <w:pPr>
+        <w:keepNext/>
+        <w:keepLines/>
+        <w:spacing w:after="0" w:line="360" w:lineRule="auto"/>
+        <w:jc w:val="both"/>
+        <w:rPr>
+          <w:rFonts w:ascii="Times New Roman" w:eastAsia="Times New Roman" w:hAnsi="Times New Roman" w:cs="Times New Roman"/>
+          <w:b/>
+          <w:sz w:val="24"/>
+          <w:szCs w:val="24"/>
+        </w:rPr>
+      </w:pPr>
+    </w:p>
+    <w:p>
+      <w:pPr>
+        <w:keepNext/>
+        <w:keepLines/>
+        <w:spacing w:after="0" w:line="360" w:lineRule="auto"/>
+        <w:jc w:val="both"/>
+        <w:rPr>
+          <w:rFonts w:ascii="Times New Roman" w:eastAsia="Times New Roman" w:hAnsi="Times New Roman" w:cs="Times New Roman"/>
+          <w:b/>
+          <w:sz w:val="24"/>
+          <w:szCs w:val="24"/>
+        </w:rPr>
+      </w:pPr>
+    </w:p>
+    <w:p>
+      <w:pPr>
+        <w:keepNext/>
+        <w:keepLines/>
+        <w:spacing w:after="0" w:line="360" w:lineRule="auto"/>
+        <w:jc w:val="both"/>
+        <w:rPr>
+          <w:rFonts w:ascii="Times New Roman" w:eastAsia="Times New Roman" w:hAnsi="Times New Roman" w:cs="Times New Roman"/>
+          <w:b/>
+          <w:sz w:val="24"/>
+          <w:szCs w:val="24"/>
+        </w:rPr>
+      </w:pPr>
+    </w:p>
+    <w:p>
+      <w:pPr>
+        <w:keepNext/>
+        <w:keepLines/>
+        <w:spacing w:after="0" w:line="360" w:lineRule="auto"/>
+        <w:jc w:val="both"/>
+        <w:rPr>
+          <w:rFonts w:ascii="Times New Roman" w:eastAsia="Times New Roman" w:hAnsi="Times New Roman" w:cs="Times New Roman"/>
+          <w:b/>
+          <w:sz w:val="24"/>
+          <w:szCs w:val="24"/>
+        </w:rPr>
+      </w:pPr>
+    </w:p>
+    <w:p>
+      <w:pPr>
+        <w:keepNext/>
+        <w:keepLines/>
+        <w:spacing w:after="0" w:line="360" w:lineRule="auto"/>
+        <w:jc w:val="both"/>
+        <w:rPr>
+          <w:rFonts w:ascii="Times New Roman" w:eastAsia="Times New Roman" w:hAnsi="Times New Roman" w:cs="Times New Roman"/>
+          <w:b/>
+          <w:sz w:val="24"/>
+          <w:szCs w:val="24"/>
+        </w:rPr>
+      </w:pPr>
+    </w:p>
+    <w:p>
+      <w:pPr>
+        <w:keepNext/>
+        <w:keepLines/>
+        <w:spacing w:after="0" w:line="360" w:lineRule="auto"/>
+        <w:jc w:val="both"/>
+        <w:rPr>
+          <w:rFonts w:ascii="Times New Roman" w:eastAsia="Times New Roman" w:hAnsi="Times New Roman" w:cs="Times New Roman"/>
+          <w:b/>
+          <w:sz w:val="24"/>
+          <w:szCs w:val="24"/>
+        </w:rPr>
+      </w:pPr>
+    </w:p>
+    <w:p>
+      <w:pPr>
         <w:pStyle w:val="Heading1"/>
       </w:pPr>
       <w:bookmarkStart w:id="9" w:name="_Toc174534496"/>
       <w:bookmarkStart w:id="10" w:name="_Toc229124957"/>
       <w:r>
+        <w:lastRenderedPageBreak/>
         <w:t>Table of Contents</w:t>
       </w:r>
       <w:bookmarkEnd w:id="9"/>
@@ -2058,9 +2467,6 @@
           <w:pPr>
             <w:pStyle w:val="TOCHeading"/>
           </w:pPr>
-          <w:r>
-            <w:t>Contents</w:t>
-          </w:r>
         </w:p>
         <w:p>
           <w:pPr>
@@ -6436,6 +6842,7 @@
           <w:szCs w:val="24"/>
           <w:lang w:val="en-GB"/>
         </w:rPr>
+        <w:lastRenderedPageBreak/>
         <w:t>I</w:t>
       </w:r>
       <w:bookmarkEnd w:id="11"/>
@@ -6454,16 +6861,17 @@
       <w:bookmarkEnd w:id="13"/>
       <w:bookmarkEnd w:id="14"/>
       <w:bookmarkEnd w:id="15"/>
-    </w:p>
-    <w:p>
-      <w:pPr>
-        <w:spacing w:line="360" w:lineRule="auto"/>
-        <w:rPr>
-          <w:rFonts w:ascii="Times New Roman" w:eastAsia="Calibri" w:hAnsi="Times New Roman" w:cs="MyriadPro-Regular"/>
-          <w:sz w:val="24"/>
-          <w:lang w:val="en-GB"/>
-        </w:rPr>
-      </w:pPr>
+      <w:r>
+        <w:rPr>
+          <w:rFonts w:ascii="Times New Roman" w:eastAsia="Times New Roman" w:hAnsi="Times New Roman" w:cs="Times New Roman"/>
+          <w:b/>
+          <w:kern w:val="28"/>
+          <w:sz w:val="24"/>
+          <w:szCs w:val="24"/>
+          <w:lang w:val="en-GB"/>
+        </w:rPr>
+        <w:t>:</w:t>
+      </w:r>
     </w:p>
     <w:p>
       <w:pPr>
@@ -6482,18 +6890,39 @@
         </w:rPr>
       </w:pPr>
       <w:bookmarkStart w:id="16" w:name="_Hlk112121914"/>
-      <w:r>
-        <w:rPr>
-          <w:rFonts w:ascii="Times New Roman" w:eastAsia="Times New Roman" w:hAnsi="Times New Roman" w:cs="Times New Roman"/>
-          <w:b/>
-          <w:bCs/>
-          <w:sz w:val="24"/>
-          <w:szCs w:val="24"/>
+    </w:p>
+    <w:p>
+      <w:pPr>
+        <w:keepNext/>
+        <w:spacing w:after="0" w:line="360" w:lineRule="auto"/>
+        <w:jc w:val="both"/>
+        <w:outlineLvl w:val="0"/>
+        <w:rPr>
+          <w:rFonts w:ascii="Times New Roman" w:eastAsia="Times New Roman" w:hAnsi="Times New Roman" w:cs="Times New Roman"/>
+          <w:b/>
+          <w:kern w:val="28"/>
+          <w:sz w:val="24"/>
+          <w:szCs w:val="20"/>
           <w:lang w:val="en-IN" w:eastAsia="en-IN"/>
         </w:rPr>
-        <w:t>Therapeutic Indication:</w:t>
-      </w:r>
-    </w:p>
+      </w:pPr>
+      <w:bookmarkStart w:id="17" w:name="_Toc174534498"/>
+      <w:bookmarkStart w:id="18" w:name="_Toc229124959"/>
+      <w:r>
+        <w:rPr>
+          <w:rFonts w:ascii="Times New Roman" w:eastAsia="Times New Roman" w:hAnsi="Times New Roman" w:cs="Times New Roman"/>
+          <w:b/>
+          <w:kern w:val="28"/>
+          <w:sz w:val="24"/>
+          <w:szCs w:val="20"/>
+          <w:lang w:val="en-IN" w:eastAsia="en-IN"/>
+        </w:rPr>
+        <w:t>2.0 Use in special population:</w:t>
+      </w:r>
+      <w:bookmarkEnd w:id="17"/>
+      <w:bookmarkEnd w:id="18"/>
+    </w:p>
+    <w:bookmarkEnd w:id="16"/>
     <w:p>
       <w:pPr>
         <w:autoSpaceDE w:val="0"/>
@@ -6503,98 +6932,6 @@
         <w:jc w:val="both"/>
         <w:rPr>
           <w:rFonts w:ascii="Times New Roman" w:eastAsia="Times New Roman" w:hAnsi="Times New Roman" w:cs="Times New Roman"/>
-          <w:sz w:val="24"/>
-          <w:szCs w:val="24"/>
-          <w:lang w:val="en-GB"/>
-        </w:rPr>
-      </w:pPr>
-    </w:p>
-    <w:p>
-      <w:pPr>
-        <w:autoSpaceDE w:val="0"/>
-        <w:autoSpaceDN w:val="0"/>
-        <w:adjustRightInd w:val="0"/>
-        <w:spacing w:after="0" w:line="360" w:lineRule="auto"/>
-        <w:jc w:val="both"/>
-        <w:rPr>
-          <w:rFonts w:ascii="Times New Roman" w:eastAsia="Times New Roman" w:hAnsi="Times New Roman" w:cs="Times New Roman"/>
-          <w:b/>
-          <w:bCs/>
-          <w:sz w:val="24"/>
-          <w:szCs w:val="24"/>
-          <w:lang w:val="en-IN" w:eastAsia="en-IN"/>
-        </w:rPr>
-      </w:pPr>
-      <w:r>
-        <w:rPr>
-          <w:rFonts w:ascii="Times New Roman" w:eastAsia="Times New Roman" w:hAnsi="Times New Roman" w:cs="Times New Roman"/>
-          <w:b/>
-          <w:bCs/>
-          <w:sz w:val="24"/>
-          <w:szCs w:val="24"/>
-          <w:lang w:val="en-IN" w:eastAsia="en-IN"/>
-        </w:rPr>
-        <w:t>Mechanism of action</w:t>
-      </w:r>
-    </w:p>
-    <w:p>
-      <w:pPr>
-        <w:autoSpaceDE w:val="0"/>
-        <w:autoSpaceDN w:val="0"/>
-        <w:adjustRightInd w:val="0"/>
-        <w:spacing w:after="0" w:line="360" w:lineRule="auto"/>
-        <w:jc w:val="both"/>
-        <w:rPr>
-          <w:rFonts w:ascii="Times New Roman" w:eastAsia="Times New Roman" w:hAnsi="Times New Roman" w:cs="Times New Roman"/>
-          <w:b/>
-          <w:bCs/>
-          <w:sz w:val="24"/>
-          <w:szCs w:val="24"/>
-          <w:lang w:val="en-IN" w:eastAsia="en-IN"/>
-        </w:rPr>
-      </w:pPr>
-    </w:p>
-    <w:p>
-      <w:pPr>
-        <w:keepNext/>
-        <w:spacing w:after="0" w:line="360" w:lineRule="auto"/>
-        <w:jc w:val="both"/>
-        <w:outlineLvl w:val="0"/>
-        <w:rPr>
-          <w:rFonts w:ascii="Times New Roman" w:eastAsia="Times New Roman" w:hAnsi="Times New Roman" w:cs="Times New Roman"/>
-          <w:b/>
-          <w:kern w:val="28"/>
-          <w:sz w:val="24"/>
-          <w:szCs w:val="20"/>
-          <w:lang w:val="en-IN" w:eastAsia="en-IN"/>
-        </w:rPr>
-      </w:pPr>
-      <w:bookmarkStart w:id="17" w:name="_Toc174534498"/>
-      <w:bookmarkStart w:id="18" w:name="_Toc229124959"/>
-      <w:r>
-        <w:rPr>
-          <w:rFonts w:ascii="Times New Roman" w:eastAsia="Times New Roman" w:hAnsi="Times New Roman" w:cs="Times New Roman"/>
-          <w:b/>
-          <w:kern w:val="28"/>
-          <w:sz w:val="24"/>
-          <w:szCs w:val="20"/>
-          <w:lang w:val="en-IN" w:eastAsia="en-IN"/>
-        </w:rPr>
-        <w:t>2.0 Use in special population:</w:t>
-      </w:r>
-      <w:bookmarkEnd w:id="17"/>
-      <w:bookmarkEnd w:id="18"/>
-    </w:p>
-    <w:bookmarkEnd w:id="16"/>
-    <w:p>
-      <w:pPr>
-        <w:autoSpaceDE w:val="0"/>
-        <w:autoSpaceDN w:val="0"/>
-        <w:adjustRightInd w:val="0"/>
-        <w:spacing w:after="0" w:line="360" w:lineRule="auto"/>
-        <w:jc w:val="both"/>
-        <w:rPr>
-          <w:rFonts w:ascii="Times New Roman" w:eastAsia="Times New Roman" w:hAnsi="Times New Roman" w:cs="Times New Roman"/>
           <w:bCs/>
           <w:sz w:val="24"/>
           <w:szCs w:val="24"/>
@@ -6634,6 +6971,17 @@
       <w:bookmarkEnd w:id="19"/>
       <w:bookmarkEnd w:id="20"/>
       <w:bookmarkEnd w:id="21"/>
+      <w:r>
+        <w:rPr>
+          <w:rFonts w:ascii="Times New Roman" w:eastAsia="Times New Roman" w:hAnsi="Times New Roman" w:cs="Times New Roman"/>
+          <w:b/>
+          <w:kern w:val="28"/>
+          <w:sz w:val="24"/>
+          <w:szCs w:val="20"/>
+          <w:lang w:val="en-GB"/>
+        </w:rPr>
+        <w:t>:</w:t>
+      </w:r>
     </w:p>
     <w:p>
       <w:pPr>
@@ -6681,13 +7029,30 @@
       <w:bookmarkEnd w:id="24"/>
       <w:bookmarkEnd w:id="25"/>
       <w:bookmarkEnd w:id="26"/>
-    </w:p>
-    <w:p>
-      <w:pPr>
-        <w:spacing w:line="360" w:lineRule="auto"/>
-        <w:rPr>
-          <w:rFonts w:ascii="Times New Roman" w:eastAsia="Calibri" w:hAnsi="Times New Roman" w:cs="MyriadPro-Regular"/>
-          <w:sz w:val="24"/>
+      <w:r>
+        <w:rPr>
+          <w:rFonts w:ascii="Times New Roman" w:eastAsia="Times New Roman" w:hAnsi="Times New Roman" w:cs="Times New Roman"/>
+          <w:b/>
+          <w:kern w:val="28"/>
+          <w:sz w:val="24"/>
+          <w:szCs w:val="20"/>
+          <w:lang w:val="en-GB"/>
+        </w:rPr>
+        <w:t>:</w:t>
+      </w:r>
+    </w:p>
+    <w:p>
+      <w:pPr>
+        <w:keepNext/>
+        <w:spacing w:after="0" w:line="360" w:lineRule="auto"/>
+        <w:jc w:val="both"/>
+        <w:outlineLvl w:val="0"/>
+        <w:rPr>
+          <w:rFonts w:ascii="Times New Roman" w:eastAsia="Times New Roman" w:hAnsi="Times New Roman" w:cs="Times New Roman"/>
+          <w:b/>
+          <w:kern w:val="28"/>
+          <w:sz w:val="24"/>
+          <w:szCs w:val="20"/>
           <w:lang w:val="en-GB"/>
         </w:rPr>
       </w:pPr>
@@ -6739,6 +7104,33 @@
       <w:bookmarkEnd w:id="29"/>
       <w:bookmarkEnd w:id="30"/>
       <w:bookmarkEnd w:id="31"/>
+      <w:r>
+        <w:rPr>
+          <w:rFonts w:ascii="Times New Roman" w:eastAsia="Times New Roman" w:hAnsi="Times New Roman" w:cs="Times New Roman"/>
+          <w:b/>
+          <w:kern w:val="28"/>
+          <w:sz w:val="24"/>
+          <w:szCs w:val="20"/>
+          <w:lang w:val="en-GB"/>
+        </w:rPr>
+        <w:t>:</w:t>
+      </w:r>
+    </w:p>
+    <w:p>
+      <w:pPr>
+        <w:keepNext/>
+        <w:spacing w:before="240" w:after="0" w:line="360" w:lineRule="auto"/>
+        <w:jc w:val="both"/>
+        <w:outlineLvl w:val="0"/>
+        <w:rPr>
+          <w:rFonts w:ascii="Times New Roman" w:eastAsia="Times New Roman" w:hAnsi="Times New Roman" w:cs="Times New Roman"/>
+          <w:b/>
+          <w:kern w:val="28"/>
+          <w:sz w:val="24"/>
+          <w:szCs w:val="20"/>
+          <w:lang w:val="en-GB"/>
+        </w:rPr>
+      </w:pPr>
     </w:p>
     <w:p>
       <w:pPr>
@@ -6771,6 +7163,8 @@
         </w:rPr>
         <w:t>6.0 Estimated Exposure and Use Patterns</w:t>
       </w:r>
+      <w:bookmarkStart w:id="37" w:name="_Toc470819906"/>
+      <w:bookmarkStart w:id="38" w:name="_Toc49785368"/>
       <w:bookmarkEnd w:id="32"/>
       <w:bookmarkEnd w:id="33"/>
       <w:bookmarkEnd w:id="34"/>
@@ -6785,10 +7179,8 @@
           <w:szCs w:val="20"/>
           <w:lang w:val="en-GB"/>
         </w:rPr>
-        <w:t xml:space="preserve"> </w:t>
-      </w:r>
-      <w:bookmarkStart w:id="37" w:name="_Toc470819906"/>
-      <w:bookmarkStart w:id="38" w:name="_Toc49785368"/>
+        <w:t>:</w:t>
+      </w:r>
     </w:p>
     <w:p>
       <w:pPr>
@@ -6832,6 +7224,16 @@
       <w:bookmarkEnd w:id="39"/>
       <w:bookmarkEnd w:id="40"/>
       <w:bookmarkEnd w:id="41"/>
+      <w:r>
+        <w:rPr>
+          <w:rFonts w:ascii="Times New Roman" w:eastAsia="Times New Roman" w:hAnsi="Times New Roman" w:cs="Times New Roman"/>
+          <w:b/>
+          <w:sz w:val="24"/>
+          <w:szCs w:val="24"/>
+          <w:lang w:val="en-GB"/>
+        </w:rPr>
+        <w:t>:</w:t>
+      </w:r>
     </w:p>
     <w:p>
       <w:pPr>
@@ -6877,6 +7279,16 @@
       <w:bookmarkEnd w:id="44"/>
       <w:bookmarkEnd w:id="45"/>
       <w:bookmarkEnd w:id="46"/>
+      <w:r>
+        <w:rPr>
+          <w:rFonts w:ascii="Times New Roman" w:eastAsia="Times New Roman" w:hAnsi="Times New Roman" w:cs="Times New Roman"/>
+          <w:b/>
+          <w:sz w:val="24"/>
+          <w:szCs w:val="24"/>
+          <w:lang w:val="en-GB"/>
+        </w:rPr>
+        <w:t>:</w:t>
+      </w:r>
     </w:p>
     <w:p>
       <w:pPr>
@@ -6928,7 +7340,7 @@
           <w:szCs w:val="24"/>
           <w:lang w:val="en-GB"/>
         </w:rPr>
-        <w:t xml:space="preserve"> </w:t>
+        <w:t>:</w:t>
       </w:r>
     </w:p>
     <w:p>
@@ -6981,7 +7393,7 @@
           <w:szCs w:val="20"/>
           <w:lang w:val="en-GB"/>
         </w:rPr>
-        <w:t xml:space="preserve"> </w:t>
+        <w:t>:</w:t>
       </w:r>
     </w:p>
     <w:p>
@@ -7036,6 +7448,16 @@
       <w:bookmarkEnd w:id="55"/>
       <w:bookmarkEnd w:id="56"/>
       <w:bookmarkEnd w:id="57"/>
+      <w:r>
+        <w:rPr>
+          <w:rFonts w:ascii="Times New Roman" w:eastAsia="Times New Roman" w:hAnsi="Times New Roman" w:cs="Times New Roman"/>
+          <w:b/>
+          <w:sz w:val="24"/>
+          <w:szCs w:val="20"/>
+          <w:lang w:val="en-GB"/>
+        </w:rPr>
+        <w:t>:</w:t>
+      </w:r>
     </w:p>
     <w:bookmarkEnd w:id="58"/>
     <w:p>
@@ -7092,6 +7514,7 @@
           <w:u w:val="single"/>
           <w:lang w:val="en-GB"/>
         </w:rPr>
+        <w:lastRenderedPageBreak/>
         <w:t>Overdose:</w:t>
       </w:r>
       <w:r>
@@ -7212,6 +7635,16 @@
       <w:bookmarkEnd w:id="66"/>
       <w:bookmarkEnd w:id="67"/>
       <w:bookmarkEnd w:id="68"/>
+      <w:r>
+        <w:rPr>
+          <w:rFonts w:ascii="Times New Roman" w:eastAsia="Times New Roman" w:hAnsi="Times New Roman" w:cs="Times New Roman"/>
+          <w:b/>
+          <w:sz w:val="24"/>
+          <w:szCs w:val="24"/>
+          <w:lang w:val="en-GB"/>
+        </w:rPr>
+        <w:t>:</w:t>
+      </w:r>
     </w:p>
     <w:p>
       <w:pPr>
@@ -7268,6 +7701,16 @@
       <w:bookmarkEnd w:id="71"/>
       <w:bookmarkEnd w:id="72"/>
       <w:bookmarkEnd w:id="73"/>
+      <w:r>
+        <w:rPr>
+          <w:rFonts w:ascii="Times New Roman" w:eastAsia="Times New Roman" w:hAnsi="Times New Roman" w:cs="Times New Roman"/>
+          <w:b/>
+          <w:sz w:val="24"/>
+          <w:szCs w:val="24"/>
+          <w:lang w:val="en-GB"/>
+        </w:rPr>
+        <w:t>:</w:t>
+      </w:r>
     </w:p>
     <w:p>
       <w:pPr>
@@ -7315,6 +7758,16 @@
       <w:bookmarkEnd w:id="76"/>
       <w:bookmarkEnd w:id="77"/>
       <w:bookmarkEnd w:id="78"/>
+      <w:r>
+        <w:rPr>
+          <w:rFonts w:ascii="Times New Roman" w:eastAsia="Times New Roman" w:hAnsi="Times New Roman" w:cs="Times New Roman"/>
+          <w:b/>
+          <w:sz w:val="24"/>
+          <w:szCs w:val="24"/>
+          <w:lang w:val="en-GB"/>
+        </w:rPr>
+        <w:t>:</w:t>
+      </w:r>
     </w:p>
     <w:p>
       <w:pPr>
@@ -7413,6 +7866,16 @@
       <w:bookmarkEnd w:id="86"/>
       <w:bookmarkEnd w:id="87"/>
       <w:bookmarkEnd w:id="88"/>
+      <w:r>
+        <w:rPr>
+          <w:rFonts w:ascii="Times New Roman" w:eastAsia="Times New Roman" w:hAnsi="Times New Roman" w:cs="Times New Roman"/>
+          <w:b/>
+          <w:sz w:val="24"/>
+          <w:szCs w:val="24"/>
+          <w:lang w:val="en-GB"/>
+        </w:rPr>
+        <w:t>:</w:t>
+      </w:r>
     </w:p>
     <w:p>
       <w:pPr>
@@ -7460,6 +7923,16 @@
       <w:bookmarkEnd w:id="91"/>
       <w:bookmarkEnd w:id="92"/>
       <w:bookmarkEnd w:id="93"/>
+      <w:r>
+        <w:rPr>
+          <w:rFonts w:ascii="Times New Roman" w:eastAsia="Times New Roman" w:hAnsi="Times New Roman" w:cs="Times New Roman"/>
+          <w:b/>
+          <w:sz w:val="24"/>
+          <w:szCs w:val="24"/>
+          <w:lang w:val="en-GB"/>
+        </w:rPr>
+        <w:t>:</w:t>
+      </w:r>
     </w:p>
     <w:p>
       <w:pPr>
@@ -7507,6 +7980,16 @@
       <w:bookmarkEnd w:id="96"/>
       <w:bookmarkEnd w:id="97"/>
       <w:bookmarkEnd w:id="98"/>
+      <w:r>
+        <w:rPr>
+          <w:rFonts w:ascii="Times New Roman" w:eastAsia="Times New Roman" w:hAnsi="Times New Roman" w:cs="Times New Roman"/>
+          <w:b/>
+          <w:sz w:val="24"/>
+          <w:szCs w:val="24"/>
+          <w:lang w:val="en-GB"/>
+        </w:rPr>
+        <w:t>:</w:t>
+      </w:r>
     </w:p>
     <w:p>
       <w:pPr>
@@ -7554,6 +8037,16 @@
       <w:bookmarkEnd w:id="101"/>
       <w:bookmarkEnd w:id="102"/>
       <w:bookmarkEnd w:id="103"/>
+      <w:r>
+        <w:rPr>
+          <w:rFonts w:ascii="Times New Roman" w:eastAsia="Times New Roman" w:hAnsi="Times New Roman" w:cs="Times New Roman"/>
+          <w:b/>
+          <w:sz w:val="24"/>
+          <w:szCs w:val="24"/>
+          <w:lang w:val="en-GB"/>
+        </w:rPr>
+        <w:t>:</w:t>
+      </w:r>
     </w:p>
     <w:p>
       <w:pPr>
@@ -7601,6 +8094,16 @@
       <w:bookmarkEnd w:id="106"/>
       <w:bookmarkEnd w:id="107"/>
       <w:bookmarkEnd w:id="108"/>
+      <w:r>
+        <w:rPr>
+          <w:rFonts w:ascii="Times New Roman" w:eastAsia="Times New Roman" w:hAnsi="Times New Roman" w:cs="Times New Roman"/>
+          <w:b/>
+          <w:sz w:val="24"/>
+          <w:szCs w:val="24"/>
+          <w:lang w:val="en-GB"/>
+        </w:rPr>
+        <w:t>:</w:t>
+      </w:r>
     </w:p>
     <w:p>
       <w:pPr>
@@ -7650,6 +8153,17 @@
       <w:bookmarkEnd w:id="111"/>
       <w:bookmarkEnd w:id="112"/>
       <w:bookmarkEnd w:id="113"/>
+      <w:r>
+        <w:rPr>
+          <w:rFonts w:ascii="Times New Roman" w:eastAsia="Times New Roman" w:hAnsi="Times New Roman" w:cs="Times New Roman"/>
+          <w:b/>
+          <w:kern w:val="28"/>
+          <w:sz w:val="24"/>
+          <w:szCs w:val="24"/>
+          <w:lang w:val="en-GB"/>
+        </w:rPr>
+        <w:t>:</w:t>
+      </w:r>
     </w:p>
     <w:p>
       <w:pPr>
@@ -7755,6 +8269,16 @@
       <w:bookmarkEnd w:id="121"/>
       <w:bookmarkEnd w:id="122"/>
       <w:bookmarkEnd w:id="123"/>
+      <w:r>
+        <w:rPr>
+          <w:rFonts w:ascii="Times New Roman" w:eastAsia="Times New Roman" w:hAnsi="Times New Roman" w:cs="Times New Roman"/>
+          <w:b/>
+          <w:sz w:val="24"/>
+          <w:szCs w:val="24"/>
+          <w:lang w:val="en-GB"/>
+        </w:rPr>
+        <w:t>:</w:t>
+      </w:r>
     </w:p>
     <w:p>
       <w:pPr>
@@ -7795,6 +8319,7 @@
           <w:szCs w:val="24"/>
           <w:lang w:val="en-GB"/>
         </w:rPr>
+        <w:lastRenderedPageBreak/>
         <w:t>10.2 Medication error</w:t>
       </w:r>
       <w:bookmarkEnd w:id="124"/>
@@ -7802,6 +8327,16 @@
       <w:bookmarkEnd w:id="126"/>
       <w:bookmarkEnd w:id="127"/>
       <w:bookmarkEnd w:id="128"/>
+      <w:r>
+        <w:rPr>
+          <w:rFonts w:ascii="Times New Roman" w:eastAsia="Times New Roman" w:hAnsi="Times New Roman" w:cs="Times New Roman"/>
+          <w:b/>
+          <w:sz w:val="24"/>
+          <w:szCs w:val="24"/>
+          <w:lang w:val="en-GB"/>
+        </w:rPr>
+        <w:t>:</w:t>
+      </w:r>
     </w:p>
     <w:p>
       <w:pPr>
@@ -7847,6 +8382,16 @@
       <w:bookmarkEnd w:id="129"/>
       <w:bookmarkEnd w:id="130"/>
       <w:bookmarkEnd w:id="131"/>
+      <w:r>
+        <w:rPr>
+          <w:rFonts w:ascii="Times New Roman" w:eastAsia="Times New Roman" w:hAnsi="Times New Roman" w:cs="Times New Roman"/>
+          <w:b/>
+          <w:sz w:val="24"/>
+          <w:szCs w:val="24"/>
+          <w:lang w:val="en-GB"/>
+        </w:rPr>
+        <w:t>:</w:t>
+      </w:r>
     </w:p>
     <w:p>
       <w:pPr>
@@ -7894,6 +8439,17 @@
       <w:bookmarkEnd w:id="134"/>
       <w:bookmarkEnd w:id="135"/>
       <w:bookmarkEnd w:id="136"/>
+      <w:r>
+        <w:rPr>
+          <w:rFonts w:ascii="Times New Roman" w:eastAsia="Times New Roman" w:hAnsi="Times New Roman" w:cs="Times New Roman"/>
+          <w:b/>
+          <w:kern w:val="28"/>
+          <w:sz w:val="24"/>
+          <w:szCs w:val="24"/>
+          <w:lang w:val="en-GB"/>
+        </w:rPr>
+        <w:t>:</w:t>
+      </w:r>
     </w:p>
     <w:p>
       <w:pPr>
@@ -7941,6 +8497,17 @@
       <w:bookmarkEnd w:id="138"/>
       <w:bookmarkEnd w:id="139"/>
       <w:bookmarkEnd w:id="140"/>
+      <w:r>
+        <w:rPr>
+          <w:rFonts w:ascii="Times New Roman" w:eastAsia="Times New Roman" w:hAnsi="Times New Roman" w:cs="Times New Roman"/>
+          <w:b/>
+          <w:kern w:val="28"/>
+          <w:sz w:val="24"/>
+          <w:szCs w:val="24"/>
+          <w:lang w:val="en-GB"/>
+        </w:rPr>
+        <w:t>:</w:t>
+      </w:r>
     </w:p>
     <w:p>
       <w:pPr>
@@ -7990,6 +8557,16 @@
       <w:bookmarkEnd w:id="144"/>
       <w:bookmarkEnd w:id="145"/>
       <w:bookmarkEnd w:id="146"/>
+      <w:r>
+        <w:rPr>
+          <w:rFonts w:ascii="Times New Roman" w:eastAsia="Times New Roman" w:hAnsi="Times New Roman" w:cs="Times New Roman"/>
+          <w:b/>
+          <w:sz w:val="24"/>
+          <w:szCs w:val="24"/>
+          <w:lang w:val="en-GB"/>
+        </w:rPr>
+        <w:t>:</w:t>
+      </w:r>
     </w:p>
     <w:p>
       <w:pPr>
@@ -8039,6 +8616,16 @@
       <w:bookmarkEnd w:id="150"/>
       <w:bookmarkEnd w:id="151"/>
       <w:bookmarkEnd w:id="152"/>
+      <w:r>
+        <w:rPr>
+          <w:rFonts w:ascii="Times New Roman" w:eastAsia="Times New Roman" w:hAnsi="Times New Roman" w:cs="Times New Roman"/>
+          <w:b/>
+          <w:sz w:val="24"/>
+          <w:szCs w:val="24"/>
+          <w:lang w:val="en-GB"/>
+        </w:rPr>
+        <w:t>:</w:t>
+      </w:r>
     </w:p>
     <w:p>
       <w:pPr>
@@ -8088,6 +8675,16 @@
       <w:bookmarkEnd w:id="156"/>
       <w:bookmarkEnd w:id="157"/>
       <w:bookmarkEnd w:id="158"/>
+      <w:r>
+        <w:rPr>
+          <w:rFonts w:ascii="Times New Roman" w:eastAsia="Times New Roman" w:hAnsi="Times New Roman" w:cs="Times New Roman"/>
+          <w:b/>
+          <w:sz w:val="24"/>
+          <w:szCs w:val="24"/>
+          <w:lang w:val="en-GB"/>
+        </w:rPr>
+        <w:t>:</w:t>
+      </w:r>
     </w:p>
     <w:p>
       <w:pPr>
@@ -8137,6 +8734,16 @@
       <w:bookmarkEnd w:id="162"/>
       <w:bookmarkEnd w:id="163"/>
       <w:bookmarkEnd w:id="164"/>
+      <w:r>
+        <w:rPr>
+          <w:rFonts w:ascii="Times New Roman" w:eastAsia="Times New Roman" w:hAnsi="Times New Roman" w:cs="Times New Roman"/>
+          <w:b/>
+          <w:sz w:val="24"/>
+          <w:szCs w:val="24"/>
+          <w:lang w:val="en-GB"/>
+        </w:rPr>
+        <w:t>:</w:t>
+      </w:r>
     </w:p>
     <w:p>
       <w:pPr>
@@ -8195,6 +8802,16 @@
       <w:bookmarkEnd w:id="168"/>
       <w:bookmarkEnd w:id="169"/>
       <w:bookmarkEnd w:id="170"/>
+      <w:r>
+        <w:rPr>
+          <w:rFonts w:ascii="Times New Roman" w:eastAsia="Times New Roman" w:hAnsi="Times New Roman" w:cs="Times New Roman"/>
+          <w:b/>
+          <w:sz w:val="24"/>
+          <w:szCs w:val="24"/>
+          <w:lang w:val="en-GB"/>
+        </w:rPr>
+        <w:t>:</w:t>
+      </w:r>
     </w:p>
     <w:p>
       <w:pPr>
@@ -8245,6 +8862,16 @@
       <w:bookmarkEnd w:id="174"/>
       <w:bookmarkEnd w:id="175"/>
       <w:bookmarkEnd w:id="176"/>
+      <w:r>
+        <w:rPr>
+          <w:rFonts w:ascii="Times New Roman" w:eastAsia="Times New Roman" w:hAnsi="Times New Roman" w:cs="Times New Roman"/>
+          <w:b/>
+          <w:sz w:val="24"/>
+          <w:szCs w:val="24"/>
+          <w:lang w:val="en-GB"/>
+        </w:rPr>
+        <w:t>:</w:t>
+      </w:r>
     </w:p>
     <w:p>
       <w:pPr>
@@ -8288,6 +8915,17 @@
       <w:bookmarkEnd w:id="177"/>
       <w:bookmarkEnd w:id="178"/>
       <w:bookmarkEnd w:id="179"/>
+      <w:r>
+        <w:rPr>
+          <w:rFonts w:ascii="Times New Roman" w:eastAsia="Times New Roman" w:hAnsi="Times New Roman" w:cs="Times New Roman"/>
+          <w:b/>
+          <w:bCs/>
+          <w:sz w:val="24"/>
+          <w:szCs w:val="24"/>
+          <w:lang w:val="en-GB"/>
+        </w:rPr>
+        <w:t>:</w:t>
+      </w:r>
     </w:p>
     <w:p>
       <w:pPr>
@@ -8337,6 +8975,16 @@
       <w:bookmarkEnd w:id="183"/>
       <w:bookmarkEnd w:id="184"/>
       <w:bookmarkEnd w:id="185"/>
+      <w:r>
+        <w:rPr>
+          <w:rFonts w:ascii="Times New Roman" w:eastAsia="Times New Roman" w:hAnsi="Times New Roman" w:cs="Times New Roman"/>
+          <w:b/>
+          <w:sz w:val="24"/>
+          <w:szCs w:val="24"/>
+          <w:lang w:val="en-GB"/>
+        </w:rPr>
+        <w:t>:</w:t>
+      </w:r>
     </w:p>
     <w:p>
       <w:pPr>
@@ -8390,6 +9038,17 @@
       <w:bookmarkEnd w:id="188"/>
       <w:bookmarkEnd w:id="189"/>
       <w:bookmarkEnd w:id="190"/>
+      <w:r>
+        <w:rPr>
+          <w:rFonts w:ascii="Times New Roman" w:eastAsia="Times New Roman" w:hAnsi="Times New Roman" w:cs="Times New Roman"/>
+          <w:b/>
+          <w:kern w:val="28"/>
+          <w:sz w:val="24"/>
+          <w:szCs w:val="24"/>
+          <w:lang w:val="en-GB"/>
+        </w:rPr>
+        <w:t>:</w:t>
+      </w:r>
     </w:p>
     <w:p>
       <w:pPr>
@@ -8432,6 +9091,7 @@
           <w:szCs w:val="24"/>
           <w:lang w:val="en-GB"/>
         </w:rPr>
+        <w:lastRenderedPageBreak/>
         <w:t>14.0 Lack of efficacy in controlled Clinical Trials</w:t>
       </w:r>
       <w:bookmarkEnd w:id="191"/>
@@ -8439,6 +9099,17 @@
       <w:bookmarkEnd w:id="193"/>
       <w:bookmarkEnd w:id="194"/>
       <w:bookmarkEnd w:id="195"/>
+      <w:r>
+        <w:rPr>
+          <w:rFonts w:ascii="Times New Roman" w:eastAsia="Times New Roman" w:hAnsi="Times New Roman" w:cs="Times New Roman"/>
+          <w:b/>
+          <w:kern w:val="28"/>
+          <w:sz w:val="24"/>
+          <w:szCs w:val="24"/>
+          <w:lang w:val="en-GB"/>
+        </w:rPr>
+        <w:t>:</w:t>
+      </w:r>
     </w:p>
     <w:p>
       <w:pPr>
@@ -8499,6 +9170,17 @@
       <w:bookmarkEnd w:id="198"/>
       <w:bookmarkEnd w:id="199"/>
       <w:bookmarkEnd w:id="200"/>
+      <w:r>
+        <w:rPr>
+          <w:rFonts w:ascii="Times New Roman" w:eastAsia="Times New Roman" w:hAnsi="Times New Roman" w:cs="Times New Roman"/>
+          <w:b/>
+          <w:kern w:val="28"/>
+          <w:sz w:val="24"/>
+          <w:szCs w:val="24"/>
+          <w:lang w:val="en-GB"/>
+        </w:rPr>
+        <w:t>:</w:t>
+      </w:r>
     </w:p>
     <w:p>
       <w:pPr>
@@ -8680,6 +9362,16 @@
       <w:bookmarkEnd w:id="213"/>
       <w:bookmarkEnd w:id="214"/>
       <w:bookmarkEnd w:id="215"/>
+      <w:r>
+        <w:rPr>
+          <w:rFonts w:ascii="Times New Roman" w:eastAsia="Times New Roman" w:hAnsi="Times New Roman" w:cs="Times New Roman"/>
+          <w:b/>
+          <w:sz w:val="24"/>
+          <w:szCs w:val="24"/>
+          <w:lang w:val="en-GB"/>
+        </w:rPr>
+        <w:t>:</w:t>
+      </w:r>
     </w:p>
     <w:p>
       <w:pPr>
@@ -8727,6 +9419,16 @@
       <w:bookmarkEnd w:id="218"/>
       <w:bookmarkEnd w:id="219"/>
       <w:bookmarkEnd w:id="220"/>
+      <w:r>
+        <w:rPr>
+          <w:rFonts w:ascii="Times New Roman" w:eastAsia="Times New Roman" w:hAnsi="Times New Roman" w:cs="Times New Roman"/>
+          <w:b/>
+          <w:sz w:val="24"/>
+          <w:szCs w:val="24"/>
+          <w:lang w:val="en-GB"/>
+        </w:rPr>
+        <w:t>:</w:t>
+      </w:r>
     </w:p>
     <w:p>
       <w:pPr>
@@ -8786,7 +9488,7 @@
           <w:szCs w:val="24"/>
           <w:lang w:val="en-GB"/>
         </w:rPr>
-        <w:t xml:space="preserve"> </w:t>
+        <w:t>:</w:t>
       </w:r>
     </w:p>
     <w:p>
@@ -8835,6 +9537,16 @@
       <w:bookmarkEnd w:id="228"/>
       <w:bookmarkEnd w:id="229"/>
       <w:bookmarkEnd w:id="230"/>
+      <w:r>
+        <w:rPr>
+          <w:rFonts w:ascii="Times New Roman" w:eastAsia="Times New Roman" w:hAnsi="Times New Roman" w:cs="Times New Roman"/>
+          <w:b/>
+          <w:sz w:val="24"/>
+          <w:szCs w:val="24"/>
+          <w:lang w:val="en-GB"/>
+        </w:rPr>
+        <w:t>:</w:t>
+      </w:r>
     </w:p>
     <w:p>
       <w:pPr>
@@ -8881,6 +9593,16 @@
       <w:bookmarkEnd w:id="233"/>
       <w:bookmarkEnd w:id="234"/>
       <w:bookmarkEnd w:id="235"/>
+      <w:r>
+        <w:rPr>
+          <w:rFonts w:ascii="Times New Roman" w:eastAsia="Times New Roman" w:hAnsi="Times New Roman" w:cs="Times New Roman"/>
+          <w:b/>
+          <w:sz w:val="24"/>
+          <w:szCs w:val="24"/>
+          <w:lang w:val="en-GB"/>
+        </w:rPr>
+        <w:t>:</w:t>
+      </w:r>
     </w:p>
     <w:p>
       <w:pPr>
@@ -8965,6 +9687,16 @@
       <w:bookmarkEnd w:id="243"/>
       <w:bookmarkEnd w:id="244"/>
       <w:bookmarkEnd w:id="245"/>
+      <w:r>
+        <w:rPr>
+          <w:rFonts w:ascii="Times New Roman" w:eastAsia="Times New Roman" w:hAnsi="Times New Roman" w:cs="Times New Roman"/>
+          <w:b/>
+          <w:sz w:val="24"/>
+          <w:szCs w:val="24"/>
+          <w:lang w:val="en-GB"/>
+        </w:rPr>
+        <w:t>:</w:t>
+      </w:r>
     </w:p>
     <w:p>
       <w:pPr>
@@ -9012,6 +9744,16 @@
       <w:bookmarkEnd w:id="248"/>
       <w:bookmarkEnd w:id="249"/>
       <w:bookmarkEnd w:id="250"/>
+      <w:r>
+        <w:rPr>
+          <w:rFonts w:ascii="Times New Roman" w:eastAsia="Times New Roman" w:hAnsi="Times New Roman" w:cs="Times New Roman"/>
+          <w:b/>
+          <w:sz w:val="24"/>
+          <w:szCs w:val="24"/>
+          <w:lang w:val="en-GB"/>
+        </w:rPr>
+        <w:t>:</w:t>
+      </w:r>
     </w:p>
     <w:p>
       <w:pPr>
@@ -9059,6 +9801,16 @@
       <w:bookmarkEnd w:id="253"/>
       <w:bookmarkEnd w:id="254"/>
       <w:bookmarkEnd w:id="255"/>
+      <w:r>
+        <w:rPr>
+          <w:rFonts w:ascii="Times New Roman" w:eastAsia="Times New Roman" w:hAnsi="Times New Roman" w:cs="Times New Roman"/>
+          <w:b/>
+          <w:sz w:val="24"/>
+          <w:szCs w:val="24"/>
+          <w:lang w:val="en-GB"/>
+        </w:rPr>
+        <w:t>:</w:t>
+      </w:r>
     </w:p>
     <w:p>
       <w:pPr>
@@ -9101,6 +9853,7 @@
           <w:szCs w:val="24"/>
           <w:lang w:val="en-GB"/>
         </w:rPr>
+        <w:lastRenderedPageBreak/>
         <w:t>19. Integrated benefit-risk analysis for authorised indications</w:t>
       </w:r>
       <w:bookmarkEnd w:id="256"/>
@@ -9143,6 +9896,16 @@
       <w:bookmarkEnd w:id="263"/>
       <w:bookmarkEnd w:id="264"/>
       <w:bookmarkEnd w:id="265"/>
+      <w:r>
+        <w:rPr>
+          <w:rFonts w:ascii="Times New Roman" w:eastAsia="Times New Roman" w:hAnsi="Times New Roman" w:cs="Times New Roman"/>
+          <w:b/>
+          <w:sz w:val="24"/>
+          <w:szCs w:val="24"/>
+          <w:lang w:val="en-GB"/>
+        </w:rPr>
+        <w:t>:</w:t>
+      </w:r>
     </w:p>
     <w:p>
       <w:pPr>
@@ -9189,6 +9952,16 @@
       <w:bookmarkEnd w:id="268"/>
       <w:bookmarkEnd w:id="269"/>
       <w:bookmarkEnd w:id="270"/>
+      <w:r>
+        <w:rPr>
+          <w:rFonts w:ascii="Times New Roman" w:eastAsia="Times New Roman" w:hAnsi="Times New Roman" w:cs="Times New Roman"/>
+          <w:b/>
+          <w:sz w:val="24"/>
+          <w:szCs w:val="24"/>
+          <w:lang w:val="en-GB"/>
+        </w:rPr>
+        <w:t>:</w:t>
+      </w:r>
     </w:p>
     <w:p>
       <w:pPr>
@@ -9238,6 +10011,17 @@
       <w:bookmarkEnd w:id="273"/>
       <w:bookmarkEnd w:id="274"/>
       <w:bookmarkEnd w:id="275"/>
+      <w:r>
+        <w:rPr>
+          <w:rFonts w:ascii="Times New Roman" w:eastAsia="Times New Roman" w:hAnsi="Times New Roman" w:cs="Times New Roman"/>
+          <w:b/>
+          <w:kern w:val="28"/>
+          <w:sz w:val="24"/>
+          <w:szCs w:val="24"/>
+          <w:lang w:val="en-GB"/>
+        </w:rPr>
+        <w:t>:</w:t>
+      </w:r>
     </w:p>
     <w:p>
       <w:pPr>
@@ -9320,6 +10104,16 @@
       <w:bookmarkEnd w:id="282"/>
       <w:bookmarkEnd w:id="283"/>
       <w:bookmarkEnd w:id="284"/>
+      <w:r>
+        <w:rPr>
+          <w:rFonts w:ascii="Times New Roman" w:eastAsia="Times New Roman" w:hAnsi="Times New Roman" w:cs="Times New Roman"/>
+          <w:b/>
+          <w:sz w:val="24"/>
+          <w:szCs w:val="24"/>
+          <w:lang w:val="en-GB"/>
+        </w:rPr>
+        <w:t>:</w:t>
+      </w:r>
     </w:p>
     <w:tbl>
       <w:tblPr>
@@ -9506,68 +10300,6 @@
           </w:p>
         </w:tc>
       </w:tr>
-      <w:tr>
-        <w:trPr>
-          <w:trHeight w:val="242"/>
-        </w:trPr>
-        <w:tc>
-          <w:tcPr>
-            <w:tcW w:w="4390" w:type="dxa"/>
-            <w:noWrap/>
-          </w:tcPr>
-          <w:p>
-            <w:pPr>
-              <w:widowControl w:val="0"/>
-              <w:autoSpaceDE w:val="0"/>
-              <w:autoSpaceDN w:val="0"/>
-              <w:spacing w:after="0" w:line="360" w:lineRule="auto"/>
-              <w:rPr>
-                <w:rFonts w:ascii="Times New Roman" w:eastAsia="Calibri" w:hAnsi="Times New Roman" w:cs="Times New Roman"/>
-                <w:sz w:val="24"/>
-                <w:szCs w:val="24"/>
-              </w:rPr>
-            </w:pPr>
-          </w:p>
-        </w:tc>
-        <w:tc>
-          <w:tcPr>
-            <w:tcW w:w="2409" w:type="dxa"/>
-            <w:noWrap/>
-          </w:tcPr>
-          <w:p>
-            <w:pPr>
-              <w:widowControl w:val="0"/>
-              <w:autoSpaceDE w:val="0"/>
-              <w:autoSpaceDN w:val="0"/>
-              <w:spacing w:after="0" w:line="360" w:lineRule="auto"/>
-              <w:rPr>
-                <w:rFonts w:ascii="Times New Roman" w:eastAsia="Calibri" w:hAnsi="Times New Roman" w:cs="Times New Roman"/>
-                <w:sz w:val="24"/>
-                <w:szCs w:val="24"/>
-              </w:rPr>
-            </w:pPr>
-          </w:p>
-        </w:tc>
-        <w:tc>
-          <w:tcPr>
-            <w:tcW w:w="2649" w:type="dxa"/>
-            <w:noWrap/>
-          </w:tcPr>
-          <w:p>
-            <w:pPr>
-              <w:widowControl w:val="0"/>
-              <w:autoSpaceDE w:val="0"/>
-              <w:autoSpaceDN w:val="0"/>
-              <w:spacing w:after="0" w:line="360" w:lineRule="auto"/>
-              <w:rPr>
-                <w:rFonts w:ascii="Times New Roman" w:eastAsia="Calibri" w:hAnsi="Times New Roman" w:cs="Times New Roman"/>
-                <w:sz w:val="24"/>
-                <w:szCs w:val="24"/>
-              </w:rPr>
-            </w:pPr>
-          </w:p>
-        </w:tc>
-      </w:tr>
     </w:tbl>
     <w:p>
       <w:pPr>
@@ -9576,67 +10308,19 @@
       <w:bookmarkStart w:id="288" w:name="_Toc174533790"/>
       <w:bookmarkStart w:id="289" w:name="_Toc174534553"/>
       <w:bookmarkStart w:id="290" w:name="_Toc229125013"/>
+    </w:p>
+    <w:p>
+      <w:pPr>
+        <w:pStyle w:val="Heading1"/>
+      </w:pPr>
       <w:r>
         <w:t>Appendix 2: Reference Safety Information</w:t>
       </w:r>
       <w:bookmarkEnd w:id="288"/>
       <w:bookmarkEnd w:id="289"/>
       <w:bookmarkEnd w:id="290"/>
-    </w:p>
-    <w:p>
-      <w:pPr>
-        <w:spacing w:line="360" w:lineRule="auto"/>
-        <w:rPr>
-          <w:lang w:val="en-GB"/>
-        </w:rPr>
-      </w:pPr>
-    </w:p>
-    <w:p>
-      <w:pPr>
-        <w:spacing w:after="0" w:line="360" w:lineRule="auto"/>
-        <w:jc w:val="both"/>
-        <w:rPr>
-          <w:rFonts w:ascii="Times New Roman" w:eastAsia="Times New Roman" w:hAnsi="Times New Roman" w:cs="Times New Roman"/>
-          <w:b/>
-          <w:bCs/>
-          <w:sz w:val="24"/>
-          <w:szCs w:val="24"/>
-          <w:lang w:val="en-GB"/>
-        </w:rPr>
-      </w:pPr>
-      <w:r>
-        <w:rPr>
-          <w:rFonts w:ascii="Times New Roman" w:eastAsia="Times New Roman" w:hAnsi="Times New Roman" w:cs="Times New Roman"/>
-          <w:b/>
-          <w:bCs/>
-          <w:sz w:val="24"/>
-          <w:szCs w:val="24"/>
-          <w:lang w:val="en-GB"/>
-        </w:rPr>
-        <w:t xml:space="preserve">WHO-PQ RECOMMENDED SUMMARY OF PRODUCT CHARACTERISTICS </w:t>
-      </w:r>
-    </w:p>
-    <w:p>
-      <w:pPr>
-        <w:spacing w:after="0" w:line="360" w:lineRule="auto"/>
-        <w:jc w:val="both"/>
-        <w:rPr>
-          <w:rFonts w:ascii="Times New Roman" w:eastAsia="Times New Roman" w:hAnsi="Times New Roman" w:cs="Times New Roman"/>
-          <w:b/>
-          <w:sz w:val="24"/>
-          <w:szCs w:val="24"/>
-          <w:lang w:val="en-GB"/>
-        </w:rPr>
-      </w:pPr>
-      <w:r>
-        <w:rPr>
-          <w:rFonts w:ascii="Times New Roman" w:eastAsia="Times New Roman" w:hAnsi="Times New Roman" w:cs="Times New Roman"/>
-          <w:b/>
-          <w:sz w:val="24"/>
-          <w:szCs w:val="24"/>
-          <w:lang w:val="en-GB"/>
-        </w:rPr>
-        <w:t>About Medicine</w:t>
+      <w:r>
+        <w:t>:</w:t>
       </w:r>
     </w:p>
     <w:p>
@@ -9687,6 +10371,16 @@
       <w:bookmarkEnd w:id="294"/>
       <w:bookmarkEnd w:id="295"/>
       <w:bookmarkEnd w:id="296"/>
+      <w:r>
+        <w:rPr>
+          <w:rFonts w:ascii="Times New Roman" w:eastAsia="Times New Roman" w:hAnsi="Times New Roman" w:cs="Times New Roman"/>
+          <w:b/>
+          <w:sz w:val="24"/>
+          <w:szCs w:val="24"/>
+          <w:lang w:val="en-GB"/>
+        </w:rPr>
+        <w:t>:</w:t>
+      </w:r>
     </w:p>
     <w:p>
       <w:pPr>
@@ -9744,6 +10438,16 @@
         </w:rPr>
         <w:t xml:space="preserve"> </w:t>
       </w:r>
+      <w:r>
+        <w:rPr>
+          <w:rFonts w:ascii="Times New Roman" w:eastAsia="Times New Roman" w:hAnsi="Times New Roman" w:cs="Times New Roman"/>
+          <w:b/>
+          <w:sz w:val="24"/>
+          <w:szCs w:val="24"/>
+          <w:lang w:val="en-GB"/>
+        </w:rPr>
+        <w:t>:</w:t>
+      </w:r>
     </w:p>
     <w:p>
       <w:pPr>
@@ -9785,6 +10489,17 @@
         <w:t>References</w:t>
       </w:r>
       <w:bookmarkEnd w:id="302"/>
+      <w:r>
+        <w:rPr>
+          <w:rFonts w:ascii="Times New Roman" w:eastAsia="Times New Roman" w:hAnsi="Times New Roman" w:cs="Times New Roman"/>
+          <w:b/>
+          <w:kern w:val="28"/>
+          <w:sz w:val="24"/>
+          <w:szCs w:val="20"/>
+          <w:lang w:val="en-GB"/>
+        </w:rPr>
+        <w:t>:</w:t>
+      </w:r>
     </w:p>
     <w:p>
       <w:pPr>
@@ -9806,10 +10521,23 @@
       <w:bookmarkEnd w:id="285"/>
       <w:bookmarkEnd w:id="286"/>
       <w:bookmarkEnd w:id="287"/>
+      <w:r>
+        <w:lastRenderedPageBreak/>
+        <w:t>Signatories:</w:t>
+      </w:r>
+    </w:p>
+    <w:p>
+      <w:pPr>
+        <w:spacing w:line="360" w:lineRule="auto"/>
+      </w:pPr>
     </w:p>
     <w:sectPr>
-      <w:headerReference w:type="default" r:id="rId9"/>
-      <w:footerReference w:type="default" r:id="rId10"/>
+      <w:headerReference w:type="even" r:id="rId9"/>
+      <w:headerReference w:type="default" r:id="rId10"/>
+      <w:footerReference w:type="even" r:id="rId11"/>
+      <w:footerReference w:type="default" r:id="rId12"/>
+      <w:headerReference w:type="first" r:id="rId13"/>
+      <w:footerReference w:type="first" r:id="rId14"/>
       <w:pgSz w:w="12240" w:h="15840"/>
       <w:pgMar w:top="1440" w:right="1260" w:bottom="1440" w:left="1440" w:header="576" w:footer="576" w:gutter="0"/>
       <w:cols w:space="720"/>
@@ -9820,7 +10548,7 @@
 </file>
 
 <file path=word/endnotes.xml><?xml version="1.0" encoding="utf-8"?>
-<w:endnotes xmlns:wpc="http://schemas.microsoft.com/office/word/2010/wordprocessingCanvas" xmlns:cx="http://schemas.microsoft.com/office/drawing/2014/chartex" xmlns:cx1="http://schemas.microsoft.com/office/drawing/2015/9/8/chartex" xmlns:cx2="http://schemas.microsoft.com/office/drawing/2015/10/21/chartex" xmlns:cx3="http://schemas.microsoft.com/office/drawing/2016/5/9/chartex" xmlns:cx4="http://schemas.microsoft.com/office/drawing/2016/5/10/chartex" xmlns:cx5="http://schemas.microsoft.com/office/drawing/2016/5/11/chartex" xmlns:cx6="http://schemas.microsoft.com/office/drawing/2016/5/12/chartex" xmlns:cx7="http://schemas.microsoft.com/office/drawing/2016/5/13/chartex" xmlns:cx8="http://schemas.microsoft.com/office/drawing/2016/5/14/chartex" xmlns:mc="http://schemas.openxmlformats.org/markup-compatibility/2006" xmlns:aink="http://schemas.microsoft.com/office/drawing/2016/ink" xmlns:am3d="http://schemas.microsoft.com/office/drawing/2017/model3d" xmlns:o="urn:schemas-microsoft-com:office:office" xmlns:oel="http://schemas.microsoft.com/office/2019/extlst" xmlns:r="http://schemas.openxmlformats.org/officeDocument/2006/relationships" xmlns:m="http://schemas.openxmlformats.org/officeDocument/2006/math" xmlns:v="urn:schemas-microsoft-com:vml" xmlns:wp14="http://schemas.microsoft.com/office/word/2010/wordprocessingDrawing" xmlns:wp="http://schemas.openxmlformats.org/drawingml/2006/wordprocessingDrawing" xmlns:w10="urn:schemas-microsoft-com:office:word" xmlns:w="http://schemas.openxmlformats.org/wordprocessingml/2006/main" xmlns:w14="http://schemas.microsoft.com/office/word/2010/wordml" xmlns:w15="http://schemas.microsoft.com/office/word/2012/wordml" xmlns:w16cex="http://schemas.microsoft.com/office/word/2018/wordml/cex" xmlns:w16cid="http://schemas.microsoft.com/office/word/2016/wordml/cid" xmlns:w16="http://schemas.microsoft.com/office/word/2018/wordml" xmlns:w16du="http://schemas.microsoft.com/office/word/2023/wordml/word16du" xmlns:w16sdtdh="http://schemas.microsoft.com/office/word/2020/wordml/sdtdatahash" xmlns:w16sdtfl="http://schemas.microsoft.com/office/word/2024/wordml/sdtformatlock" xmlns:w16se="http://schemas.microsoft.com/office/word/2015/wordml/symex" xmlns:wpg="http://schemas.microsoft.com/office/word/2010/wordprocessingGroup" xmlns:wpi="http://schemas.microsoft.com/office/word/2010/wordprocessingInk" xmlns:wne="http://schemas.microsoft.com/office/word/2006/wordml" xmlns:wps="http://schemas.microsoft.com/office/word/2010/wordprocessingShape" mc:Ignorable="w14 w15 w16se w16cid w16 w16cex w16sdtdh w16sdtfl w16du wp14">
+<w:endnotes xmlns:wpc="http://schemas.microsoft.com/office/word/2010/wordprocessingCanvas" xmlns:cx="http://schemas.microsoft.com/office/drawing/2014/chartex" xmlns:cx1="http://schemas.microsoft.com/office/drawing/2015/9/8/chartex" xmlns:cx2="http://schemas.microsoft.com/office/drawing/2015/10/21/chartex" xmlns:cx3="http://schemas.microsoft.com/office/drawing/2016/5/9/chartex" xmlns:cx4="http://schemas.microsoft.com/office/drawing/2016/5/10/chartex" xmlns:cx5="http://schemas.microsoft.com/office/drawing/2016/5/11/chartex" xmlns:cx6="http://schemas.microsoft.com/office/drawing/2016/5/12/chartex" xmlns:cx7="http://schemas.microsoft.com/office/drawing/2016/5/13/chartex" xmlns:cx8="http://schemas.microsoft.com/office/drawing/2016/5/14/chartex" xmlns:mc="http://schemas.openxmlformats.org/markup-compatibility/2006" xmlns:aink="http://schemas.microsoft.com/office/drawing/2016/ink" xmlns:am3d="http://schemas.microsoft.com/office/drawing/2017/model3d" xmlns:o="urn:schemas-microsoft-com:office:office" xmlns:oel="http://schemas.microsoft.com/office/2019/extlst" xmlns:r="http://schemas.openxmlformats.org/officeDocument/2006/relationships" xmlns:m="http://schemas.openxmlformats.org/officeDocument/2006/math" xmlns:v="urn:schemas-microsoft-com:vml" xmlns:wp14="http://schemas.microsoft.com/office/word/2010/wordprocessingDrawing" xmlns:wp="http://schemas.openxmlformats.org/drawingml/2006/wordprocessingDrawing" xmlns:w10="urn:schemas-microsoft-com:office:word" xmlns:w="http://schemas.openxmlformats.org/wordprocessingml/2006/main" xmlns:w14="http://schemas.microsoft.com/office/word/2010/wordml" xmlns:w15="http://schemas.microsoft.com/office/word/2012/wordml" xmlns:w16cex="http://schemas.microsoft.com/office/word/2018/wordml/cex" xmlns:w16cid="http://schemas.microsoft.com/office/word/2016/wordml/cid" xmlns:w16="http://schemas.microsoft.com/office/word/2018/wordml" xmlns:w16du="http://schemas.microsoft.com/office/word/2023/wordml/word16du" xmlns:w16sdtdh="http://schemas.microsoft.com/office/word/2020/wordml/sdtdatahash" xmlns:w16se="http://schemas.microsoft.com/office/word/2015/wordml/symex" xmlns:wpg="http://schemas.microsoft.com/office/word/2010/wordprocessingGroup" xmlns:wpi="http://schemas.microsoft.com/office/word/2010/wordprocessingInk" xmlns:wne="http://schemas.microsoft.com/office/word/2006/wordml" xmlns:wps="http://schemas.microsoft.com/office/word/2010/wordprocessingShape" mc:Ignorable="w14 w15 w16se w16cid w16 w16cex w16sdtdh w16du wp14">
   <w:endnote w:type="separator" w:id="-1">
     <w:p>
       <w:pPr>
@@ -9845,619 +10573,17 @@
 </file>
 
 <file path=word/footer1.xml><?xml version="1.0" encoding="utf-8"?>
-<w:ftr xmlns:wpc="http://schemas.microsoft.com/office/word/2010/wordprocessingCanvas" xmlns:cx="http://schemas.microsoft.com/office/drawing/2014/chartex" xmlns:cx1="http://schemas.microsoft.com/office/drawing/2015/9/8/chartex" xmlns:cx2="http://schemas.microsoft.com/office/drawing/2015/10/21/chartex" xmlns:cx3="http://schemas.microsoft.com/office/drawing/2016/5/9/chartex" xmlns:cx4="http://schemas.microsoft.com/office/drawing/2016/5/10/chartex" xmlns:cx5="http://schemas.microsoft.com/office/drawing/2016/5/11/chartex" xmlns:cx6="http://schemas.microsoft.com/office/drawing/2016/5/12/chartex" xmlns:cx7="http://schemas.microsoft.com/office/drawing/2016/5/13/chartex" xmlns:cx8="http://schemas.microsoft.com/office/drawing/2016/5/14/chartex" xmlns:mc="http://schemas.openxmlformats.org/markup-compatibility/2006" xmlns:aink="http://schemas.microsoft.com/office/drawing/2016/ink" xmlns:am3d="http://schemas.microsoft.com/office/drawing/2017/model3d" xmlns:o="urn:schemas-microsoft-com:office:office" xmlns:oel="http://schemas.microsoft.com/office/2019/extlst" xmlns:r="http://schemas.openxmlformats.org/officeDocument/2006/relationships" xmlns:m="http://schemas.openxmlformats.org/officeDocument/2006/math" xmlns:v="urn:schemas-microsoft-com:vml" xmlns:wp14="http://schemas.microsoft.com/office/word/2010/wordprocessingDrawing" xmlns:wp="http://schemas.openxmlformats.org/drawingml/2006/wordprocessingDrawing" xmlns:w10="urn:schemas-microsoft-com:office:word" xmlns:w="http://schemas.openxmlformats.org/wordprocessingml/2006/main" xmlns:w14="http://schemas.microsoft.com/office/word/2010/wordml" xmlns:w15="http://schemas.microsoft.com/office/word/2012/wordml" xmlns:w16cex="http://schemas.microsoft.com/office/word/2018/wordml/cex" xmlns:w16cid="http://schemas.microsoft.com/office/word/2016/wordml/cid" xmlns:w16="http://schemas.microsoft.com/office/word/2018/wordml" xmlns:w16du="http://schemas.microsoft.com/office/word/2023/wordml/word16du" xmlns:w16sdtdh="http://schemas.microsoft.com/office/word/2020/wordml/sdtdatahash" xmlns:w16sdtfl="http://schemas.microsoft.com/office/word/2024/wordml/sdtformatlock" xmlns:w16se="http://schemas.microsoft.com/office/word/2015/wordml/symex" xmlns:wpg="http://schemas.microsoft.com/office/word/2010/wordprocessingGroup" xmlns:wpi="http://schemas.microsoft.com/office/word/2010/wordprocessingInk" xmlns:wne="http://schemas.microsoft.com/office/word/2006/wordml" xmlns:wps="http://schemas.microsoft.com/office/word/2010/wordprocessingShape" mc:Ignorable="w14 w15 w16se w16cid w16 w16cex w16sdtdh w16sdtfl w16du wp14">
-  <w:tbl>
-    <w:tblPr>
-      <w:tblStyle w:val="TableGrid"/>
-      <w:tblW w:w="10632" w:type="dxa"/>
-      <w:jc w:val="center"/>
-      <w:tblLook w:val="04A0" w:firstRow="1" w:lastRow="0" w:firstColumn="1" w:lastColumn="0" w:noHBand="0" w:noVBand="1"/>
-    </w:tblPr>
-    <w:tblGrid>
-      <w:gridCol w:w="1701"/>
-      <w:gridCol w:w="1926"/>
-      <w:gridCol w:w="1710"/>
-      <w:gridCol w:w="2070"/>
-      <w:gridCol w:w="3225"/>
-    </w:tblGrid>
-    <w:tr>
-      <w:trPr>
-        <w:trHeight w:hRule="exact" w:val="340"/>
-        <w:jc w:val="center"/>
-      </w:trPr>
-      <w:tc>
-        <w:tcPr>
-          <w:tcW w:w="1701" w:type="dxa"/>
-        </w:tcPr>
-        <w:p>
-          <w:pPr>
-            <w:pStyle w:val="Footer"/>
-            <w:jc w:val="center"/>
-            <w:rPr>
-              <w:rFonts w:ascii="Times New Roman" w:hAnsi="Times New Roman" w:cs="Times New Roman"/>
-              <w:sz w:val="20"/>
-              <w:szCs w:val="20"/>
-            </w:rPr>
-          </w:pPr>
-        </w:p>
-      </w:tc>
-      <w:tc>
-        <w:tcPr>
-          <w:tcW w:w="1926" w:type="dxa"/>
-        </w:tcPr>
-        <w:p>
-          <w:pPr>
-            <w:pStyle w:val="Footer"/>
-            <w:jc w:val="center"/>
-            <w:rPr>
-              <w:rFonts w:ascii="Times New Roman" w:hAnsi="Times New Roman" w:cs="Times New Roman"/>
-              <w:b/>
-              <w:bCs/>
-              <w:sz w:val="20"/>
-              <w:szCs w:val="20"/>
-            </w:rPr>
-          </w:pPr>
-          <w:r>
-            <w:rPr>
-              <w:rFonts w:ascii="Times New Roman" w:hAnsi="Times New Roman" w:cs="Times New Roman"/>
-              <w:b/>
-              <w:bCs/>
-              <w:sz w:val="20"/>
-              <w:szCs w:val="20"/>
-            </w:rPr>
-            <w:t>PREPARED BY</w:t>
-          </w:r>
-        </w:p>
-      </w:tc>
-      <w:tc>
-        <w:tcPr>
-          <w:tcW w:w="1710" w:type="dxa"/>
-        </w:tcPr>
-        <w:p>
-          <w:pPr>
-            <w:pStyle w:val="Footer"/>
-            <w:jc w:val="center"/>
-            <w:rPr>
-              <w:rFonts w:ascii="Times New Roman" w:hAnsi="Times New Roman" w:cs="Times New Roman"/>
-              <w:b/>
-              <w:bCs/>
-              <w:sz w:val="20"/>
-              <w:szCs w:val="20"/>
-            </w:rPr>
-          </w:pPr>
-          <w:r>
-            <w:rPr>
-              <w:rFonts w:ascii="Times New Roman" w:hAnsi="Times New Roman" w:cs="Times New Roman"/>
-              <w:b/>
-              <w:bCs/>
-              <w:sz w:val="20"/>
-              <w:szCs w:val="20"/>
-            </w:rPr>
-            <w:t>REVIEWED BY</w:t>
-          </w:r>
-        </w:p>
-      </w:tc>
-      <w:tc>
-        <w:tcPr>
-          <w:tcW w:w="2070" w:type="dxa"/>
-        </w:tcPr>
-        <w:p>
-          <w:pPr>
-            <w:pStyle w:val="Footer"/>
-            <w:jc w:val="center"/>
-            <w:rPr>
-              <w:rFonts w:ascii="Times New Roman" w:hAnsi="Times New Roman" w:cs="Times New Roman"/>
-              <w:b/>
-              <w:bCs/>
-              <w:sz w:val="20"/>
-              <w:szCs w:val="20"/>
-            </w:rPr>
-          </w:pPr>
-          <w:r>
-            <w:rPr>
-              <w:rFonts w:ascii="Times New Roman" w:hAnsi="Times New Roman" w:cs="Times New Roman"/>
-              <w:b/>
-              <w:bCs/>
-              <w:sz w:val="20"/>
-              <w:szCs w:val="20"/>
-            </w:rPr>
-            <w:t>APPROVED BY</w:t>
-          </w:r>
-        </w:p>
-      </w:tc>
-      <w:tc>
-        <w:tcPr>
-          <w:tcW w:w="3225" w:type="dxa"/>
-        </w:tcPr>
-        <w:p>
-          <w:pPr>
-            <w:pStyle w:val="Footer"/>
-            <w:jc w:val="center"/>
-            <w:rPr>
-              <w:rFonts w:ascii="Times New Roman" w:hAnsi="Times New Roman" w:cs="Times New Roman"/>
-              <w:b/>
-              <w:bCs/>
-              <w:sz w:val="20"/>
-              <w:szCs w:val="20"/>
-            </w:rPr>
-          </w:pPr>
-          <w:r>
-            <w:rPr>
-              <w:rFonts w:ascii="Times New Roman" w:hAnsi="Times New Roman" w:cs="Times New Roman"/>
-              <w:b/>
-              <w:bCs/>
-              <w:sz w:val="20"/>
-              <w:szCs w:val="20"/>
-            </w:rPr>
-            <w:t>AUTHORISED BY</w:t>
-          </w:r>
-        </w:p>
-      </w:tc>
-    </w:tr>
-    <w:tr>
-      <w:trPr>
-        <w:trHeight w:hRule="exact" w:val="393"/>
-        <w:jc w:val="center"/>
-      </w:trPr>
-      <w:tc>
-        <w:tcPr>
-          <w:tcW w:w="1701" w:type="dxa"/>
-        </w:tcPr>
-        <w:p>
-          <w:pPr>
-            <w:pStyle w:val="Footer"/>
-            <w:jc w:val="center"/>
-            <w:rPr>
-              <w:rFonts w:ascii="Times New Roman" w:hAnsi="Times New Roman" w:cs="Times New Roman"/>
-              <w:b/>
-              <w:bCs/>
-              <w:sz w:val="20"/>
-              <w:szCs w:val="20"/>
-            </w:rPr>
-          </w:pPr>
-          <w:r>
-            <w:rPr>
-              <w:rFonts w:ascii="Times New Roman" w:hAnsi="Times New Roman" w:cs="Times New Roman"/>
-              <w:b/>
-              <w:bCs/>
-              <w:sz w:val="20"/>
-              <w:szCs w:val="20"/>
-            </w:rPr>
-            <w:t>NAME</w:t>
-          </w:r>
-        </w:p>
-      </w:tc>
-      <w:tc>
-        <w:tcPr>
-          <w:tcW w:w="1926" w:type="dxa"/>
-        </w:tcPr>
-        <w:p>
-          <w:pPr>
-            <w:pStyle w:val="Footer"/>
-            <w:jc w:val="center"/>
-            <w:rPr>
-              <w:rFonts w:ascii="Times New Roman" w:hAnsi="Times New Roman" w:cs="Times New Roman"/>
-              <w:sz w:val="20"/>
-              <w:szCs w:val="20"/>
-            </w:rPr>
-          </w:pPr>
-          <w:r>
-            <w:rPr>
-              <w:rFonts w:ascii="Times New Roman" w:hAnsi="Times New Roman" w:cs="Times New Roman"/>
-              <w:sz w:val="20"/>
-              <w:szCs w:val="20"/>
-            </w:rPr>
-            <w:t>EZEKIEL K</w:t>
-          </w:r>
-        </w:p>
-      </w:tc>
-      <w:tc>
-        <w:tcPr>
-          <w:tcW w:w="1710" w:type="dxa"/>
-        </w:tcPr>
-        <w:p>
-          <w:pPr>
-            <w:pStyle w:val="Footer"/>
-            <w:jc w:val="center"/>
-            <w:rPr>
-              <w:rFonts w:ascii="Times New Roman" w:hAnsi="Times New Roman" w:cs="Times New Roman"/>
-              <w:sz w:val="20"/>
-              <w:szCs w:val="20"/>
-            </w:rPr>
-          </w:pPr>
-          <w:r>
-            <w:rPr>
-              <w:rFonts w:ascii="Times New Roman" w:hAnsi="Times New Roman" w:cs="Times New Roman"/>
-              <w:sz w:val="20"/>
-              <w:szCs w:val="20"/>
-            </w:rPr>
-            <w:t>YONA ODOI</w:t>
-          </w:r>
-        </w:p>
-      </w:tc>
-      <w:tc>
-        <w:tcPr>
-          <w:tcW w:w="2070" w:type="dxa"/>
-        </w:tcPr>
-        <w:p>
-          <w:pPr>
-            <w:pStyle w:val="Footer"/>
-            <w:rPr>
-              <w:rFonts w:ascii="Times New Roman" w:hAnsi="Times New Roman" w:cs="Times New Roman"/>
-              <w:sz w:val="20"/>
-              <w:szCs w:val="20"/>
-            </w:rPr>
-          </w:pPr>
-          <w:r>
-            <w:rPr>
-              <w:rFonts w:ascii="Times New Roman" w:hAnsi="Times New Roman" w:cs="Times New Roman"/>
-              <w:sz w:val="20"/>
-              <w:szCs w:val="20"/>
-            </w:rPr>
-            <w:t xml:space="preserve">    JOSEPH KARARA</w:t>
-          </w:r>
-        </w:p>
-      </w:tc>
-      <w:tc>
-        <w:tcPr>
-          <w:tcW w:w="3225" w:type="dxa"/>
-        </w:tcPr>
-        <w:p>
-          <w:pPr>
-            <w:pStyle w:val="Footer"/>
-            <w:jc w:val="center"/>
-            <w:rPr>
-              <w:rFonts w:ascii="Times New Roman" w:hAnsi="Times New Roman" w:cs="Times New Roman"/>
-              <w:sz w:val="20"/>
-              <w:szCs w:val="20"/>
-            </w:rPr>
-          </w:pPr>
-          <w:r>
-            <w:rPr>
-              <w:rFonts w:ascii="Times New Roman" w:hAnsi="Times New Roman" w:cs="Times New Roman"/>
-              <w:sz w:val="20"/>
-              <w:szCs w:val="20"/>
-            </w:rPr>
-            <w:t>KEITH ARUHO</w:t>
-          </w:r>
-        </w:p>
-      </w:tc>
-    </w:tr>
-    <w:tr>
-      <w:trPr>
-        <w:trHeight w:hRule="exact" w:val="503"/>
-        <w:jc w:val="center"/>
-      </w:trPr>
-      <w:tc>
-        <w:tcPr>
-          <w:tcW w:w="1701" w:type="dxa"/>
-        </w:tcPr>
-        <w:p>
-          <w:pPr>
-            <w:pStyle w:val="Footer"/>
-            <w:jc w:val="center"/>
-            <w:rPr>
-              <w:rFonts w:ascii="Times New Roman" w:hAnsi="Times New Roman" w:cs="Times New Roman"/>
-              <w:b/>
-              <w:bCs/>
-              <w:sz w:val="20"/>
-              <w:szCs w:val="20"/>
-            </w:rPr>
-          </w:pPr>
-          <w:r>
-            <w:rPr>
-              <w:rFonts w:ascii="Times New Roman" w:hAnsi="Times New Roman" w:cs="Times New Roman"/>
-              <w:b/>
-              <w:bCs/>
-              <w:sz w:val="20"/>
-              <w:szCs w:val="20"/>
-            </w:rPr>
-            <w:t>DESIGNATION</w:t>
-          </w:r>
-        </w:p>
-      </w:tc>
-      <w:tc>
-        <w:tcPr>
-          <w:tcW w:w="1926" w:type="dxa"/>
-        </w:tcPr>
-        <w:p>
-          <w:pPr>
-            <w:pStyle w:val="Footer"/>
-            <w:jc w:val="center"/>
-            <w:rPr>
-              <w:rFonts w:ascii="Times New Roman" w:hAnsi="Times New Roman" w:cs="Times New Roman"/>
-              <w:sz w:val="20"/>
-              <w:szCs w:val="20"/>
-            </w:rPr>
-          </w:pPr>
-          <w:r>
-            <w:rPr>
-              <w:rFonts w:ascii="Times New Roman" w:hAnsi="Times New Roman" w:cs="Times New Roman"/>
-              <w:sz w:val="20"/>
-              <w:szCs w:val="20"/>
-            </w:rPr>
-            <w:t>RA OFFICER</w:t>
-          </w:r>
-        </w:p>
-      </w:tc>
-      <w:tc>
-        <w:tcPr>
-          <w:tcW w:w="1710" w:type="dxa"/>
-        </w:tcPr>
-        <w:p>
-          <w:pPr>
-            <w:pStyle w:val="Footer"/>
-            <w:jc w:val="center"/>
-            <w:rPr>
-              <w:rFonts w:ascii="Times New Roman" w:hAnsi="Times New Roman" w:cs="Times New Roman"/>
-              <w:sz w:val="20"/>
-              <w:szCs w:val="20"/>
-            </w:rPr>
-          </w:pPr>
-          <w:r>
-            <w:rPr>
-              <w:rFonts w:ascii="Times New Roman" w:hAnsi="Times New Roman" w:cs="Times New Roman"/>
-              <w:sz w:val="20"/>
-              <w:szCs w:val="20"/>
-            </w:rPr>
-            <w:t>Q.P.P.V.</w:t>
-          </w:r>
-        </w:p>
-      </w:tc>
-      <w:tc>
-        <w:tcPr>
-          <w:tcW w:w="2070" w:type="dxa"/>
-        </w:tcPr>
-        <w:p>
-          <w:pPr>
-            <w:pStyle w:val="Footer"/>
-            <w:jc w:val="center"/>
-            <w:rPr>
-              <w:rFonts w:ascii="Times New Roman" w:hAnsi="Times New Roman" w:cs="Times New Roman"/>
-              <w:sz w:val="20"/>
-              <w:szCs w:val="20"/>
-            </w:rPr>
-          </w:pPr>
-          <w:r>
-            <w:rPr>
-              <w:rFonts w:ascii="Times New Roman" w:hAnsi="Times New Roman" w:cs="Times New Roman"/>
-              <w:sz w:val="20"/>
-              <w:szCs w:val="20"/>
-            </w:rPr>
-            <w:t>Q</w:t>
-          </w:r>
-          <w:r>
-            <w:rPr>
-              <w:rFonts w:ascii="Times New Roman" w:hAnsi="Times New Roman" w:cs="Times New Roman"/>
-              <w:sz w:val="20"/>
-              <w:szCs w:val="20"/>
-            </w:rPr>
-            <w:t>.A MANAGER</w:t>
-          </w:r>
-        </w:p>
-      </w:tc>
-      <w:tc>
-        <w:tcPr>
-          <w:tcW w:w="3225" w:type="dxa"/>
-        </w:tcPr>
-        <w:p>
-          <w:pPr>
-            <w:pStyle w:val="Footer"/>
-            <w:jc w:val="center"/>
-            <w:rPr>
-              <w:rFonts w:ascii="Times New Roman" w:hAnsi="Times New Roman" w:cs="Times New Roman"/>
-              <w:sz w:val="20"/>
-              <w:szCs w:val="20"/>
-            </w:rPr>
-          </w:pPr>
-          <w:r>
-            <w:rPr>
-              <w:rFonts w:ascii="Times New Roman" w:hAnsi="Times New Roman" w:cs="Times New Roman"/>
-              <w:sz w:val="20"/>
-              <w:szCs w:val="20"/>
-            </w:rPr>
-            <w:t>GROUP HEAD OF REGULATORY AFFAIRS AND QUALITY</w:t>
-          </w:r>
-        </w:p>
-      </w:tc>
-    </w:tr>
-    <w:tr>
-      <w:trPr>
-        <w:trHeight w:hRule="exact" w:val="340"/>
-        <w:jc w:val="center"/>
-      </w:trPr>
-      <w:tc>
-        <w:tcPr>
-          <w:tcW w:w="1701" w:type="dxa"/>
-        </w:tcPr>
-        <w:p>
-          <w:pPr>
-            <w:pStyle w:val="Footer"/>
-            <w:jc w:val="center"/>
-            <w:rPr>
-              <w:rFonts w:ascii="Times New Roman" w:hAnsi="Times New Roman" w:cs="Times New Roman"/>
-              <w:b/>
-              <w:bCs/>
-              <w:sz w:val="20"/>
-              <w:szCs w:val="20"/>
-            </w:rPr>
-          </w:pPr>
-          <w:r>
-            <w:rPr>
-              <w:rFonts w:ascii="Times New Roman" w:hAnsi="Times New Roman" w:cs="Times New Roman"/>
-              <w:b/>
-              <w:bCs/>
-              <w:sz w:val="20"/>
-              <w:szCs w:val="20"/>
-            </w:rPr>
-            <w:t>SIGNATURE</w:t>
-          </w:r>
-        </w:p>
-      </w:tc>
-      <w:tc>
-        <w:tcPr>
-          <w:tcW w:w="1926" w:type="dxa"/>
-        </w:tcPr>
-        <w:p>
-          <w:pPr>
-            <w:pStyle w:val="Footer"/>
-            <w:jc w:val="center"/>
-            <w:rPr>
-              <w:rFonts w:ascii="Times New Roman" w:hAnsi="Times New Roman" w:cs="Times New Roman"/>
-              <w:sz w:val="20"/>
-              <w:szCs w:val="20"/>
-            </w:rPr>
-          </w:pPr>
-        </w:p>
-      </w:tc>
-      <w:tc>
-        <w:tcPr>
-          <w:tcW w:w="1710" w:type="dxa"/>
-        </w:tcPr>
-        <w:p>
-          <w:pPr>
-            <w:pStyle w:val="Footer"/>
-            <w:jc w:val="center"/>
-            <w:rPr>
-              <w:rFonts w:ascii="Times New Roman" w:hAnsi="Times New Roman" w:cs="Times New Roman"/>
-              <w:sz w:val="20"/>
-              <w:szCs w:val="20"/>
-            </w:rPr>
-          </w:pPr>
-        </w:p>
-      </w:tc>
-      <w:tc>
-        <w:tcPr>
-          <w:tcW w:w="2070" w:type="dxa"/>
-        </w:tcPr>
-        <w:p>
-          <w:pPr>
-            <w:pStyle w:val="Footer"/>
-            <w:jc w:val="center"/>
-            <w:rPr>
-              <w:rFonts w:ascii="Times New Roman" w:hAnsi="Times New Roman" w:cs="Times New Roman"/>
-              <w:sz w:val="20"/>
-              <w:szCs w:val="20"/>
-            </w:rPr>
-          </w:pPr>
-        </w:p>
-      </w:tc>
-      <w:tc>
-        <w:tcPr>
-          <w:tcW w:w="3225" w:type="dxa"/>
-        </w:tcPr>
-        <w:p>
-          <w:pPr>
-            <w:pStyle w:val="Footer"/>
-            <w:jc w:val="center"/>
-            <w:rPr>
-              <w:rFonts w:ascii="Times New Roman" w:hAnsi="Times New Roman" w:cs="Times New Roman"/>
-              <w:sz w:val="20"/>
-              <w:szCs w:val="20"/>
-            </w:rPr>
-          </w:pPr>
-        </w:p>
-      </w:tc>
-    </w:tr>
-    <w:tr>
-      <w:trPr>
-        <w:trHeight w:hRule="exact" w:val="340"/>
-        <w:jc w:val="center"/>
-      </w:trPr>
-      <w:tc>
-        <w:tcPr>
-          <w:tcW w:w="1701" w:type="dxa"/>
-        </w:tcPr>
-        <w:p>
-          <w:pPr>
-            <w:pStyle w:val="Footer"/>
-            <w:jc w:val="center"/>
-            <w:rPr>
-              <w:rFonts w:ascii="Times New Roman" w:hAnsi="Times New Roman" w:cs="Times New Roman"/>
-              <w:b/>
-              <w:bCs/>
-              <w:sz w:val="20"/>
-              <w:szCs w:val="20"/>
-            </w:rPr>
-          </w:pPr>
-          <w:r>
-            <w:rPr>
-              <w:rFonts w:ascii="Times New Roman" w:hAnsi="Times New Roman" w:cs="Times New Roman"/>
-              <w:b/>
-              <w:bCs/>
-              <w:sz w:val="20"/>
-              <w:szCs w:val="20"/>
-            </w:rPr>
-            <w:t>DATE</w:t>
-          </w:r>
-        </w:p>
-      </w:tc>
-      <w:tc>
-        <w:tcPr>
-          <w:tcW w:w="1926" w:type="dxa"/>
-        </w:tcPr>
-        <w:p>
-          <w:pPr>
-            <w:pStyle w:val="Footer"/>
-            <w:jc w:val="center"/>
-            <w:rPr>
-              <w:rFonts w:ascii="Times New Roman" w:hAnsi="Times New Roman" w:cs="Times New Roman"/>
-              <w:sz w:val="20"/>
-              <w:szCs w:val="20"/>
-            </w:rPr>
-          </w:pPr>
-        </w:p>
-      </w:tc>
-      <w:tc>
-        <w:tcPr>
-          <w:tcW w:w="1710" w:type="dxa"/>
-        </w:tcPr>
-        <w:p>
-          <w:pPr>
-            <w:pStyle w:val="Footer"/>
-            <w:jc w:val="center"/>
-            <w:rPr>
-              <w:rFonts w:ascii="Times New Roman" w:hAnsi="Times New Roman" w:cs="Times New Roman"/>
-              <w:sz w:val="20"/>
-              <w:szCs w:val="20"/>
-            </w:rPr>
-          </w:pPr>
-        </w:p>
-      </w:tc>
-      <w:tc>
-        <w:tcPr>
-          <w:tcW w:w="2070" w:type="dxa"/>
-        </w:tcPr>
-        <w:p>
-          <w:pPr>
-            <w:pStyle w:val="Footer"/>
-            <w:jc w:val="center"/>
-            <w:rPr>
-              <w:rFonts w:ascii="Times New Roman" w:hAnsi="Times New Roman" w:cs="Times New Roman"/>
-              <w:sz w:val="20"/>
-              <w:szCs w:val="20"/>
-            </w:rPr>
-          </w:pPr>
-        </w:p>
-      </w:tc>
-      <w:tc>
-        <w:tcPr>
-          <w:tcW w:w="3225" w:type="dxa"/>
-        </w:tcPr>
-        <w:p>
-          <w:pPr>
-            <w:pStyle w:val="Footer"/>
-            <w:jc w:val="center"/>
-            <w:rPr>
-              <w:rFonts w:ascii="Times New Roman" w:hAnsi="Times New Roman" w:cs="Times New Roman"/>
-              <w:sz w:val="20"/>
-              <w:szCs w:val="20"/>
-            </w:rPr>
-          </w:pPr>
-        </w:p>
-      </w:tc>
-    </w:tr>
-  </w:tbl>
+<w:ftr xmlns:wpc="http://schemas.microsoft.com/office/word/2010/wordprocessingCanvas" xmlns:cx="http://schemas.microsoft.com/office/drawing/2014/chartex" xmlns:cx1="http://schemas.microsoft.com/office/drawing/2015/9/8/chartex" xmlns:cx2="http://schemas.microsoft.com/office/drawing/2015/10/21/chartex" xmlns:cx3="http://schemas.microsoft.com/office/drawing/2016/5/9/chartex" xmlns:cx4="http://schemas.microsoft.com/office/drawing/2016/5/10/chartex" xmlns:cx5="http://schemas.microsoft.com/office/drawing/2016/5/11/chartex" xmlns:cx6="http://schemas.microsoft.com/office/drawing/2016/5/12/chartex" xmlns:cx7="http://schemas.microsoft.com/office/drawing/2016/5/13/chartex" xmlns:cx8="http://schemas.microsoft.com/office/drawing/2016/5/14/chartex" xmlns:mc="http://schemas.openxmlformats.org/markup-compatibility/2006" xmlns:aink="http://schemas.microsoft.com/office/drawing/2016/ink" xmlns:am3d="http://schemas.microsoft.com/office/drawing/2017/model3d" xmlns:o="urn:schemas-microsoft-com:office:office" xmlns:oel="http://schemas.microsoft.com/office/2019/extlst" xmlns:r="http://schemas.openxmlformats.org/officeDocument/2006/relationships" xmlns:m="http://schemas.openxmlformats.org/officeDocument/2006/math" xmlns:v="urn:schemas-microsoft-com:vml" xmlns:wp14="http://schemas.microsoft.com/office/word/2010/wordprocessingDrawing" xmlns:wp="http://schemas.openxmlformats.org/drawingml/2006/wordprocessingDrawing" xmlns:w10="urn:schemas-microsoft-com:office:word" xmlns:w="http://schemas.openxmlformats.org/wordprocessingml/2006/main" xmlns:w14="http://schemas.microsoft.com/office/word/2010/wordml" xmlns:w15="http://schemas.microsoft.com/office/word/2012/wordml" xmlns:w16cex="http://schemas.microsoft.com/office/word/2018/wordml/cex" xmlns:w16cid="http://schemas.microsoft.com/office/word/2016/wordml/cid" xmlns:w16="http://schemas.microsoft.com/office/word/2018/wordml" xmlns:w16du="http://schemas.microsoft.com/office/word/2023/wordml/word16du" xmlns:w16sdtdh="http://schemas.microsoft.com/office/word/2020/wordml/sdtdatahash" xmlns:w16se="http://schemas.microsoft.com/office/word/2015/wordml/symex" xmlns:wpg="http://schemas.microsoft.com/office/word/2010/wordprocessingGroup" xmlns:wpi="http://schemas.microsoft.com/office/word/2010/wordprocessingInk" xmlns:wne="http://schemas.microsoft.com/office/word/2006/wordml" xmlns:wps="http://schemas.microsoft.com/office/word/2010/wordprocessingShape" mc:Ignorable="w14 w15 w16se w16cid w16 w16cex w16sdtdh w16du wp14">
+  <w:p>
+    <w:pPr>
+      <w:pStyle w:val="Footer"/>
+    </w:pPr>
+  </w:p>
+</w:ftr>
+</file>
+
+<file path=word/footer2.xml><?xml version="1.0" encoding="utf-8"?>
+<w:ftr xmlns:wpc="http://schemas.microsoft.com/office/word/2010/wordprocessingCanvas" xmlns:cx="http://schemas.microsoft.com/office/drawing/2014/chartex" xmlns:cx1="http://schemas.microsoft.com/office/drawing/2015/9/8/chartex" xmlns:cx2="http://schemas.microsoft.com/office/drawing/2015/10/21/chartex" xmlns:cx3="http://schemas.microsoft.com/office/drawing/2016/5/9/chartex" xmlns:cx4="http://schemas.microsoft.com/office/drawing/2016/5/10/chartex" xmlns:cx5="http://schemas.microsoft.com/office/drawing/2016/5/11/chartex" xmlns:cx6="http://schemas.microsoft.com/office/drawing/2016/5/12/chartex" xmlns:cx7="http://schemas.microsoft.com/office/drawing/2016/5/13/chartex" xmlns:cx8="http://schemas.microsoft.com/office/drawing/2016/5/14/chartex" xmlns:mc="http://schemas.openxmlformats.org/markup-compatibility/2006" xmlns:aink="http://schemas.microsoft.com/office/drawing/2016/ink" xmlns:am3d="http://schemas.microsoft.com/office/drawing/2017/model3d" xmlns:o="urn:schemas-microsoft-com:office:office" xmlns:oel="http://schemas.microsoft.com/office/2019/extlst" xmlns:r="http://schemas.openxmlformats.org/officeDocument/2006/relationships" xmlns:m="http://schemas.openxmlformats.org/officeDocument/2006/math" xmlns:v="urn:schemas-microsoft-com:vml" xmlns:wp14="http://schemas.microsoft.com/office/word/2010/wordprocessingDrawing" xmlns:wp="http://schemas.openxmlformats.org/drawingml/2006/wordprocessingDrawing" xmlns:w10="urn:schemas-microsoft-com:office:word" xmlns:w="http://schemas.openxmlformats.org/wordprocessingml/2006/main" xmlns:w14="http://schemas.microsoft.com/office/word/2010/wordml" xmlns:w15="http://schemas.microsoft.com/office/word/2012/wordml" xmlns:w16cex="http://schemas.microsoft.com/office/word/2018/wordml/cex" xmlns:w16cid="http://schemas.microsoft.com/office/word/2016/wordml/cid" xmlns:w16="http://schemas.microsoft.com/office/word/2018/wordml" xmlns:w16du="http://schemas.microsoft.com/office/word/2023/wordml/word16du" xmlns:w16sdtdh="http://schemas.microsoft.com/office/word/2020/wordml/sdtdatahash" xmlns:w16se="http://schemas.microsoft.com/office/word/2015/wordml/symex" xmlns:wpg="http://schemas.microsoft.com/office/word/2010/wordprocessingGroup" xmlns:wpi="http://schemas.microsoft.com/office/word/2010/wordprocessingInk" xmlns:wne="http://schemas.microsoft.com/office/word/2006/wordml" xmlns:wps="http://schemas.microsoft.com/office/word/2010/wordprocessingShape" mc:Ignorable="w14 w15 w16se w16cid w16 w16cex w16sdtdh w16du wp14">
   <w:p>
     <w:pPr>
       <w:pStyle w:val="Footer"/>
@@ -10471,8 +10597,18 @@
 </w:ftr>
 </file>
 
+<file path=word/footer3.xml><?xml version="1.0" encoding="utf-8"?>
+<w:ftr xmlns:wpc="http://schemas.microsoft.com/office/word/2010/wordprocessingCanvas" xmlns:cx="http://schemas.microsoft.com/office/drawing/2014/chartex" xmlns:cx1="http://schemas.microsoft.com/office/drawing/2015/9/8/chartex" xmlns:cx2="http://schemas.microsoft.com/office/drawing/2015/10/21/chartex" xmlns:cx3="http://schemas.microsoft.com/office/drawing/2016/5/9/chartex" xmlns:cx4="http://schemas.microsoft.com/office/drawing/2016/5/10/chartex" xmlns:cx5="http://schemas.microsoft.com/office/drawing/2016/5/11/chartex" xmlns:cx6="http://schemas.microsoft.com/office/drawing/2016/5/12/chartex" xmlns:cx7="http://schemas.microsoft.com/office/drawing/2016/5/13/chartex" xmlns:cx8="http://schemas.microsoft.com/office/drawing/2016/5/14/chartex" xmlns:mc="http://schemas.openxmlformats.org/markup-compatibility/2006" xmlns:aink="http://schemas.microsoft.com/office/drawing/2016/ink" xmlns:am3d="http://schemas.microsoft.com/office/drawing/2017/model3d" xmlns:o="urn:schemas-microsoft-com:office:office" xmlns:oel="http://schemas.microsoft.com/office/2019/extlst" xmlns:r="http://schemas.openxmlformats.org/officeDocument/2006/relationships" xmlns:m="http://schemas.openxmlformats.org/officeDocument/2006/math" xmlns:v="urn:schemas-microsoft-com:vml" xmlns:wp14="http://schemas.microsoft.com/office/word/2010/wordprocessingDrawing" xmlns:wp="http://schemas.openxmlformats.org/drawingml/2006/wordprocessingDrawing" xmlns:w10="urn:schemas-microsoft-com:office:word" xmlns:w="http://schemas.openxmlformats.org/wordprocessingml/2006/main" xmlns:w14="http://schemas.microsoft.com/office/word/2010/wordml" xmlns:w15="http://schemas.microsoft.com/office/word/2012/wordml" xmlns:w16cex="http://schemas.microsoft.com/office/word/2018/wordml/cex" xmlns:w16cid="http://schemas.microsoft.com/office/word/2016/wordml/cid" xmlns:w16="http://schemas.microsoft.com/office/word/2018/wordml" xmlns:w16du="http://schemas.microsoft.com/office/word/2023/wordml/word16du" xmlns:w16sdtdh="http://schemas.microsoft.com/office/word/2020/wordml/sdtdatahash" xmlns:w16se="http://schemas.microsoft.com/office/word/2015/wordml/symex" xmlns:wpg="http://schemas.microsoft.com/office/word/2010/wordprocessingGroup" xmlns:wpi="http://schemas.microsoft.com/office/word/2010/wordprocessingInk" xmlns:wne="http://schemas.microsoft.com/office/word/2006/wordml" xmlns:wps="http://schemas.microsoft.com/office/word/2010/wordprocessingShape" mc:Ignorable="w14 w15 w16se w16cid w16 w16cex w16sdtdh w16du wp14">
+  <w:p>
+    <w:pPr>
+      <w:pStyle w:val="Footer"/>
+    </w:pPr>
+  </w:p>
+</w:ftr>
+</file>
+
 <file path=word/footnotes.xml><?xml version="1.0" encoding="utf-8"?>
-<w:footnotes xmlns:wpc="http://schemas.microsoft.com/office/word/2010/wordprocessingCanvas" xmlns:cx="http://schemas.microsoft.com/office/drawing/2014/chartex" xmlns:cx1="http://schemas.microsoft.com/office/drawing/2015/9/8/chartex" xmlns:cx2="http://schemas.microsoft.com/office/drawing/2015/10/21/chartex" xmlns:cx3="http://schemas.microsoft.com/office/drawing/2016/5/9/chartex" xmlns:cx4="http://schemas.microsoft.com/office/drawing/2016/5/10/chartex" xmlns:cx5="http://schemas.microsoft.com/office/drawing/2016/5/11/chartex" xmlns:cx6="http://schemas.microsoft.com/office/drawing/2016/5/12/chartex" xmlns:cx7="http://schemas.microsoft.com/office/drawing/2016/5/13/chartex" xmlns:cx8="http://schemas.microsoft.com/office/drawing/2016/5/14/chartex" xmlns:mc="http://schemas.openxmlformats.org/markup-compatibility/2006" xmlns:aink="http://schemas.microsoft.com/office/drawing/2016/ink" xmlns:am3d="http://schemas.microsoft.com/office/drawing/2017/model3d" xmlns:o="urn:schemas-microsoft-com:office:office" xmlns:oel="http://schemas.microsoft.com/office/2019/extlst" xmlns:r="http://schemas.openxmlformats.org/officeDocument/2006/relationships" xmlns:m="http://schemas.openxmlformats.org/officeDocument/2006/math" xmlns:v="urn:schemas-microsoft-com:vml" xmlns:wp14="http://schemas.microsoft.com/office/word/2010/wordprocessingDrawing" xmlns:wp="http://schemas.openxmlformats.org/drawingml/2006/wordprocessingDrawing" xmlns:w10="urn:schemas-microsoft-com:office:word" xmlns:w="http://schemas.openxmlformats.org/wordprocessingml/2006/main" xmlns:w14="http://schemas.microsoft.com/office/word/2010/wordml" xmlns:w15="http://schemas.microsoft.com/office/word/2012/wordml" xmlns:w16cex="http://schemas.microsoft.com/office/word/2018/wordml/cex" xmlns:w16cid="http://schemas.microsoft.com/office/word/2016/wordml/cid" xmlns:w16="http://schemas.microsoft.com/office/word/2018/wordml" xmlns:w16du="http://schemas.microsoft.com/office/word/2023/wordml/word16du" xmlns:w16sdtdh="http://schemas.microsoft.com/office/word/2020/wordml/sdtdatahash" xmlns:w16sdtfl="http://schemas.microsoft.com/office/word/2024/wordml/sdtformatlock" xmlns:w16se="http://schemas.microsoft.com/office/word/2015/wordml/symex" xmlns:wpg="http://schemas.microsoft.com/office/word/2010/wordprocessingGroup" xmlns:wpi="http://schemas.microsoft.com/office/word/2010/wordprocessingInk" xmlns:wne="http://schemas.microsoft.com/office/word/2006/wordml" xmlns:wps="http://schemas.microsoft.com/office/word/2010/wordprocessingShape" mc:Ignorable="w14 w15 w16se w16cid w16 w16cex w16sdtdh w16sdtfl w16du wp14">
+<w:footnotes xmlns:wpc="http://schemas.microsoft.com/office/word/2010/wordprocessingCanvas" xmlns:cx="http://schemas.microsoft.com/office/drawing/2014/chartex" xmlns:cx1="http://schemas.microsoft.com/office/drawing/2015/9/8/chartex" xmlns:cx2="http://schemas.microsoft.com/office/drawing/2015/10/21/chartex" xmlns:cx3="http://schemas.microsoft.com/office/drawing/2016/5/9/chartex" xmlns:cx4="http://schemas.microsoft.com/office/drawing/2016/5/10/chartex" xmlns:cx5="http://schemas.microsoft.com/office/drawing/2016/5/11/chartex" xmlns:cx6="http://schemas.microsoft.com/office/drawing/2016/5/12/chartex" xmlns:cx7="http://schemas.microsoft.com/office/drawing/2016/5/13/chartex" xmlns:cx8="http://schemas.microsoft.com/office/drawing/2016/5/14/chartex" xmlns:mc="http://schemas.openxmlformats.org/markup-compatibility/2006" xmlns:aink="http://schemas.microsoft.com/office/drawing/2016/ink" xmlns:am3d="http://schemas.microsoft.com/office/drawing/2017/model3d" xmlns:o="urn:schemas-microsoft-com:office:office" xmlns:oel="http://schemas.microsoft.com/office/2019/extlst" xmlns:r="http://schemas.openxmlformats.org/officeDocument/2006/relationships" xmlns:m="http://schemas.openxmlformats.org/officeDocument/2006/math" xmlns:v="urn:schemas-microsoft-com:vml" xmlns:wp14="http://schemas.microsoft.com/office/word/2010/wordprocessingDrawing" xmlns:wp="http://schemas.openxmlformats.org/drawingml/2006/wordprocessingDrawing" xmlns:w10="urn:schemas-microsoft-com:office:word" xmlns:w="http://schemas.openxmlformats.org/wordprocessingml/2006/main" xmlns:w14="http://schemas.microsoft.com/office/word/2010/wordml" xmlns:w15="http://schemas.microsoft.com/office/word/2012/wordml" xmlns:w16cex="http://schemas.microsoft.com/office/word/2018/wordml/cex" xmlns:w16cid="http://schemas.microsoft.com/office/word/2016/wordml/cid" xmlns:w16="http://schemas.microsoft.com/office/word/2018/wordml" xmlns:w16du="http://schemas.microsoft.com/office/word/2023/wordml/word16du" xmlns:w16sdtdh="http://schemas.microsoft.com/office/word/2020/wordml/sdtdatahash" xmlns:w16se="http://schemas.microsoft.com/office/word/2015/wordml/symex" xmlns:wpg="http://schemas.microsoft.com/office/word/2010/wordprocessingGroup" xmlns:wpi="http://schemas.microsoft.com/office/word/2010/wordprocessingInk" xmlns:wne="http://schemas.microsoft.com/office/word/2006/wordml" xmlns:wps="http://schemas.microsoft.com/office/word/2010/wordprocessingShape" mc:Ignorable="w14 w15 w16se w16cid w16 w16cex w16sdtdh w16du wp14">
   <w:footnote w:type="separator" w:id="-1">
     <w:p>
       <w:pPr>
@@ -10497,7 +10633,17 @@
 </file>
 
 <file path=word/header1.xml><?xml version="1.0" encoding="utf-8"?>
-<w:hdr xmlns:wpc="http://schemas.microsoft.com/office/word/2010/wordprocessingCanvas" xmlns:cx="http://schemas.microsoft.com/office/drawing/2014/chartex" xmlns:cx1="http://schemas.microsoft.com/office/drawing/2015/9/8/chartex" xmlns:cx2="http://schemas.microsoft.com/office/drawing/2015/10/21/chartex" xmlns:cx3="http://schemas.microsoft.com/office/drawing/2016/5/9/chartex" xmlns:cx4="http://schemas.microsoft.com/office/drawing/2016/5/10/chartex" xmlns:cx5="http://schemas.microsoft.com/office/drawing/2016/5/11/chartex" xmlns:cx6="http://schemas.microsoft.com/office/drawing/2016/5/12/chartex" xmlns:cx7="http://schemas.microsoft.com/office/drawing/2016/5/13/chartex" xmlns:cx8="http://schemas.microsoft.com/office/drawing/2016/5/14/chartex" xmlns:mc="http://schemas.openxmlformats.org/markup-compatibility/2006" xmlns:aink="http://schemas.microsoft.com/office/drawing/2016/ink" xmlns:am3d="http://schemas.microsoft.com/office/drawing/2017/model3d" xmlns:o="urn:schemas-microsoft-com:office:office" xmlns:oel="http://schemas.microsoft.com/office/2019/extlst" xmlns:r="http://schemas.openxmlformats.org/officeDocument/2006/relationships" xmlns:m="http://schemas.openxmlformats.org/officeDocument/2006/math" xmlns:v="urn:schemas-microsoft-com:vml" xmlns:wp14="http://schemas.microsoft.com/office/word/2010/wordprocessingDrawing" xmlns:wp="http://schemas.openxmlformats.org/drawingml/2006/wordprocessingDrawing" xmlns:w10="urn:schemas-microsoft-com:office:word" xmlns:w="http://schemas.openxmlformats.org/wordprocessingml/2006/main" xmlns:w14="http://schemas.microsoft.com/office/word/2010/wordml" xmlns:w15="http://schemas.microsoft.com/office/word/2012/wordml" xmlns:w16cex="http://schemas.microsoft.com/office/word/2018/wordml/cex" xmlns:w16cid="http://schemas.microsoft.com/office/word/2016/wordml/cid" xmlns:w16="http://schemas.microsoft.com/office/word/2018/wordml" xmlns:w16du="http://schemas.microsoft.com/office/word/2023/wordml/word16du" xmlns:w16sdtdh="http://schemas.microsoft.com/office/word/2020/wordml/sdtdatahash" xmlns:w16sdtfl="http://schemas.microsoft.com/office/word/2024/wordml/sdtformatlock" xmlns:w16se="http://schemas.microsoft.com/office/word/2015/wordml/symex" xmlns:wpg="http://schemas.microsoft.com/office/word/2010/wordprocessingGroup" xmlns:wpi="http://schemas.microsoft.com/office/word/2010/wordprocessingInk" xmlns:wne="http://schemas.microsoft.com/office/word/2006/wordml" xmlns:wps="http://schemas.microsoft.com/office/word/2010/wordprocessingShape" mc:Ignorable="w14 w15 w16se w16cid w16 w16cex w16sdtdh w16sdtfl w16du wp14">
+<w:hdr xmlns:wpc="http://schemas.microsoft.com/office/word/2010/wordprocessingCanvas" xmlns:cx="http://schemas.microsoft.com/office/drawing/2014/chartex" xmlns:cx1="http://schemas.microsoft.com/office/drawing/2015/9/8/chartex" xmlns:cx2="http://schemas.microsoft.com/office/drawing/2015/10/21/chartex" xmlns:cx3="http://schemas.microsoft.com/office/drawing/2016/5/9/chartex" xmlns:cx4="http://schemas.microsoft.com/office/drawing/2016/5/10/chartex" xmlns:cx5="http://schemas.microsoft.com/office/drawing/2016/5/11/chartex" xmlns:cx6="http://schemas.microsoft.com/office/drawing/2016/5/12/chartex" xmlns:cx7="http://schemas.microsoft.com/office/drawing/2016/5/13/chartex" xmlns:cx8="http://schemas.microsoft.com/office/drawing/2016/5/14/chartex" xmlns:mc="http://schemas.openxmlformats.org/markup-compatibility/2006" xmlns:aink="http://schemas.microsoft.com/office/drawing/2016/ink" xmlns:am3d="http://schemas.microsoft.com/office/drawing/2017/model3d" xmlns:o="urn:schemas-microsoft-com:office:office" xmlns:oel="http://schemas.microsoft.com/office/2019/extlst" xmlns:r="http://schemas.openxmlformats.org/officeDocument/2006/relationships" xmlns:m="http://schemas.openxmlformats.org/officeDocument/2006/math" xmlns:v="urn:schemas-microsoft-com:vml" xmlns:wp14="http://schemas.microsoft.com/office/word/2010/wordprocessingDrawing" xmlns:wp="http://schemas.openxmlformats.org/drawingml/2006/wordprocessingDrawing" xmlns:w10="urn:schemas-microsoft-com:office:word" xmlns:w="http://schemas.openxmlformats.org/wordprocessingml/2006/main" xmlns:w14="http://schemas.microsoft.com/office/word/2010/wordml" xmlns:w15="http://schemas.microsoft.com/office/word/2012/wordml" xmlns:w16cex="http://schemas.microsoft.com/office/word/2018/wordml/cex" xmlns:w16cid="http://schemas.microsoft.com/office/word/2016/wordml/cid" xmlns:w16="http://schemas.microsoft.com/office/word/2018/wordml" xmlns:w16du="http://schemas.microsoft.com/office/word/2023/wordml/word16du" xmlns:w16sdtdh="http://schemas.microsoft.com/office/word/2020/wordml/sdtdatahash" xmlns:w16se="http://schemas.microsoft.com/office/word/2015/wordml/symex" xmlns:wpg="http://schemas.microsoft.com/office/word/2010/wordprocessingGroup" xmlns:wpi="http://schemas.microsoft.com/office/word/2010/wordprocessingInk" xmlns:wne="http://schemas.microsoft.com/office/word/2006/wordml" xmlns:wps="http://schemas.microsoft.com/office/word/2010/wordprocessingShape" mc:Ignorable="w14 w15 w16se w16cid w16 w16cex w16sdtdh w16du wp14">
+  <w:p>
+    <w:pPr>
+      <w:pStyle w:val="Header"/>
+    </w:pPr>
+  </w:p>
+</w:hdr>
+</file>
+
+<file path=word/header2.xml><?xml version="1.0" encoding="utf-8"?>
+<w:hdr xmlns:wpc="http://schemas.microsoft.com/office/word/2010/wordprocessingCanvas" xmlns:cx="http://schemas.microsoft.com/office/drawing/2014/chartex" xmlns:cx1="http://schemas.microsoft.com/office/drawing/2015/9/8/chartex" xmlns:cx2="http://schemas.microsoft.com/office/drawing/2015/10/21/chartex" xmlns:cx3="http://schemas.microsoft.com/office/drawing/2016/5/9/chartex" xmlns:cx4="http://schemas.microsoft.com/office/drawing/2016/5/10/chartex" xmlns:cx5="http://schemas.microsoft.com/office/drawing/2016/5/11/chartex" xmlns:cx6="http://schemas.microsoft.com/office/drawing/2016/5/12/chartex" xmlns:cx7="http://schemas.microsoft.com/office/drawing/2016/5/13/chartex" xmlns:cx8="http://schemas.microsoft.com/office/drawing/2016/5/14/chartex" xmlns:mc="http://schemas.openxmlformats.org/markup-compatibility/2006" xmlns:aink="http://schemas.microsoft.com/office/drawing/2016/ink" xmlns:am3d="http://schemas.microsoft.com/office/drawing/2017/model3d" xmlns:o="urn:schemas-microsoft-com:office:office" xmlns:oel="http://schemas.microsoft.com/office/2019/extlst" xmlns:r="http://schemas.openxmlformats.org/officeDocument/2006/relationships" xmlns:m="http://schemas.openxmlformats.org/officeDocument/2006/math" xmlns:v="urn:schemas-microsoft-com:vml" xmlns:wp14="http://schemas.microsoft.com/office/word/2010/wordprocessingDrawing" xmlns:wp="http://schemas.openxmlformats.org/drawingml/2006/wordprocessingDrawing" xmlns:w10="urn:schemas-microsoft-com:office:word" xmlns:w="http://schemas.openxmlformats.org/wordprocessingml/2006/main" xmlns:w14="http://schemas.microsoft.com/office/word/2010/wordml" xmlns:w15="http://schemas.microsoft.com/office/word/2012/wordml" xmlns:w16cex="http://schemas.microsoft.com/office/word/2018/wordml/cex" xmlns:w16cid="http://schemas.microsoft.com/office/word/2016/wordml/cid" xmlns:w16="http://schemas.microsoft.com/office/word/2018/wordml" xmlns:w16du="http://schemas.microsoft.com/office/word/2023/wordml/word16du" xmlns:w16sdtdh="http://schemas.microsoft.com/office/word/2020/wordml/sdtdatahash" xmlns:w16se="http://schemas.microsoft.com/office/word/2015/wordml/symex" xmlns:wpg="http://schemas.microsoft.com/office/word/2010/wordprocessingGroup" xmlns:wpi="http://schemas.microsoft.com/office/word/2010/wordprocessingInk" xmlns:wne="http://schemas.microsoft.com/office/word/2006/wordml" xmlns:wps="http://schemas.microsoft.com/office/word/2010/wordprocessingShape" mc:Ignorable="w14 w15 w16se w16cid w16 w16cex w16sdtdh w16du wp14">
   <w:p>
     <w:pPr>
       <w:pStyle w:val="Header"/>
@@ -10718,7 +10864,6 @@
             </w:rPr>
             <w:t xml:space="preserve">       </w:t>
           </w:r>
-          <w:proofErr w:type="gramStart"/>
           <w:r>
             <w:rPr>
               <w:rFonts w:ascii="Times New Roman" w:hAnsi="Times New Roman" w:cs="Times New Roman"/>
@@ -10737,7 +10882,6 @@
             </w:rPr>
             <w:t>:</w:t>
           </w:r>
-          <w:proofErr w:type="gramEnd"/>
           <w:r>
             <w:rPr>
               <w:rFonts w:ascii="Times New Roman" w:hAnsi="Times New Roman" w:cs="Times New Roman"/>
@@ -10754,7 +10898,7 @@
               <w:sz w:val="24"/>
               <w:szCs w:val="24"/>
             </w:rPr>
-            <w:t>PSUR OR PBRERs TEMPLATE</w:t>
+            <w:t>PERIODIC SAFETY UPDATE REPORT</w:t>
           </w:r>
           <w:r>
             <w:rPr>
@@ -10839,17 +10983,7 @@
               <w:sz w:val="24"/>
               <w:szCs w:val="24"/>
             </w:rPr>
-            <w:t xml:space="preserve">  </w:t>
-          </w:r>
-          <w:proofErr w:type="gramStart"/>
-          <w:r>
-            <w:rPr>
-              <w:rFonts w:ascii="Times New Roman" w:hAnsi="Times New Roman" w:cs="Times New Roman"/>
-              <w:b/>
-              <w:sz w:val="24"/>
-              <w:szCs w:val="24"/>
-            </w:rPr>
-            <w:t xml:space="preserve">  </w:t>
+            <w:t xml:space="preserve">    </w:t>
           </w:r>
           <w:r>
             <w:rPr>
@@ -10860,7 +10994,6 @@
             </w:rPr>
             <w:t>:</w:t>
           </w:r>
-          <w:proofErr w:type="gramEnd"/>
           <w:r>
             <w:rPr>
               <w:rFonts w:ascii="Times New Roman" w:hAnsi="Times New Roman" w:cs="Times New Roman"/>
@@ -10974,17 +11107,7 @@
               <w:sz w:val="24"/>
               <w:szCs w:val="24"/>
             </w:rPr>
-            <w:t xml:space="preserve">REVISION </w:t>
-          </w:r>
-          <w:proofErr w:type="gramStart"/>
-          <w:r>
-            <w:rPr>
-              <w:rFonts w:ascii="Times New Roman" w:hAnsi="Times New Roman" w:cs="Times New Roman"/>
-              <w:b/>
-              <w:sz w:val="24"/>
-              <w:szCs w:val="24"/>
-            </w:rPr>
-            <w:t>STATUS</w:t>
+            <w:t>REVISION STATUS</w:t>
           </w:r>
           <w:r>
             <w:rPr>
@@ -11004,7 +11127,6 @@
             </w:rPr>
             <w:t>:</w:t>
           </w:r>
-          <w:proofErr w:type="gramEnd"/>
           <w:r>
             <w:rPr>
               <w:rFonts w:ascii="Times New Roman" w:hAnsi="Times New Roman" w:cs="Times New Roman"/>
@@ -11089,7 +11211,6 @@
             </w:rPr>
             <w:t xml:space="preserve"> </w:t>
           </w:r>
-          <w:proofErr w:type="gramStart"/>
           <w:r>
             <w:rPr>
               <w:rFonts w:ascii="Times New Roman" w:hAnsi="Times New Roman" w:cs="Times New Roman"/>
@@ -11115,7 +11236,6 @@
             </w:rPr>
             <w:t>:</w:t>
           </w:r>
-          <w:proofErr w:type="gramEnd"/>
           <w:r>
             <w:rPr>
               <w:rFonts w:ascii="Times New Roman" w:hAnsi="Times New Roman" w:cs="Times New Roman"/>
@@ -11146,8 +11266,18 @@
 </w:hdr>
 </file>
 
+<file path=word/header3.xml><?xml version="1.0" encoding="utf-8"?>
+<w:hdr xmlns:wpc="http://schemas.microsoft.com/office/word/2010/wordprocessingCanvas" xmlns:cx="http://schemas.microsoft.com/office/drawing/2014/chartex" xmlns:cx1="http://schemas.microsoft.com/office/drawing/2015/9/8/chartex" xmlns:cx2="http://schemas.microsoft.com/office/drawing/2015/10/21/chartex" xmlns:cx3="http://schemas.microsoft.com/office/drawing/2016/5/9/chartex" xmlns:cx4="http://schemas.microsoft.com/office/drawing/2016/5/10/chartex" xmlns:cx5="http://schemas.microsoft.com/office/drawing/2016/5/11/chartex" xmlns:cx6="http://schemas.microsoft.com/office/drawing/2016/5/12/chartex" xmlns:cx7="http://schemas.microsoft.com/office/drawing/2016/5/13/chartex" xmlns:cx8="http://schemas.microsoft.com/office/drawing/2016/5/14/chartex" xmlns:mc="http://schemas.openxmlformats.org/markup-compatibility/2006" xmlns:aink="http://schemas.microsoft.com/office/drawing/2016/ink" xmlns:am3d="http://schemas.microsoft.com/office/drawing/2017/model3d" xmlns:o="urn:schemas-microsoft-com:office:office" xmlns:oel="http://schemas.microsoft.com/office/2019/extlst" xmlns:r="http://schemas.openxmlformats.org/officeDocument/2006/relationships" xmlns:m="http://schemas.openxmlformats.org/officeDocument/2006/math" xmlns:v="urn:schemas-microsoft-com:vml" xmlns:wp14="http://schemas.microsoft.com/office/word/2010/wordprocessingDrawing" xmlns:wp="http://schemas.openxmlformats.org/drawingml/2006/wordprocessingDrawing" xmlns:w10="urn:schemas-microsoft-com:office:word" xmlns:w="http://schemas.openxmlformats.org/wordprocessingml/2006/main" xmlns:w14="http://schemas.microsoft.com/office/word/2010/wordml" xmlns:w15="http://schemas.microsoft.com/office/word/2012/wordml" xmlns:w16cex="http://schemas.microsoft.com/office/word/2018/wordml/cex" xmlns:w16cid="http://schemas.microsoft.com/office/word/2016/wordml/cid" xmlns:w16="http://schemas.microsoft.com/office/word/2018/wordml" xmlns:w16du="http://schemas.microsoft.com/office/word/2023/wordml/word16du" xmlns:w16sdtdh="http://schemas.microsoft.com/office/word/2020/wordml/sdtdatahash" xmlns:w16se="http://schemas.microsoft.com/office/word/2015/wordml/symex" xmlns:wpg="http://schemas.microsoft.com/office/word/2010/wordprocessingGroup" xmlns:wpi="http://schemas.microsoft.com/office/word/2010/wordprocessingInk" xmlns:wne="http://schemas.microsoft.com/office/word/2006/wordml" xmlns:wps="http://schemas.microsoft.com/office/word/2010/wordprocessingShape" mc:Ignorable="w14 w15 w16se w16cid w16 w16cex w16sdtdh w16du wp14">
+  <w:p>
+    <w:pPr>
+      <w:pStyle w:val="Header"/>
+    </w:pPr>
+  </w:p>
+</w:hdr>
+</file>
+
 <file path=word/numbering.xml><?xml version="1.0" encoding="utf-8"?>
-<w:numbering xmlns:wpc="http://schemas.microsoft.com/office/word/2010/wordprocessingCanvas" xmlns:cx="http://schemas.microsoft.com/office/drawing/2014/chartex" xmlns:cx1="http://schemas.microsoft.com/office/drawing/2015/9/8/chartex" xmlns:cx2="http://schemas.microsoft.com/office/drawing/2015/10/21/chartex" xmlns:cx3="http://schemas.microsoft.com/office/drawing/2016/5/9/chartex" xmlns:cx4="http://schemas.microsoft.com/office/drawing/2016/5/10/chartex" xmlns:cx5="http://schemas.microsoft.com/office/drawing/2016/5/11/chartex" xmlns:cx6="http://schemas.microsoft.com/office/drawing/2016/5/12/chartex" xmlns:cx7="http://schemas.microsoft.com/office/drawing/2016/5/13/chartex" xmlns:cx8="http://schemas.microsoft.com/office/drawing/2016/5/14/chartex" xmlns:mc="http://schemas.openxmlformats.org/markup-compatibility/2006" xmlns:aink="http://schemas.microsoft.com/office/drawing/2016/ink" xmlns:am3d="http://schemas.microsoft.com/office/drawing/2017/model3d" xmlns:o="urn:schemas-microsoft-com:office:office" xmlns:oel="http://schemas.microsoft.com/office/2019/extlst" xmlns:r="http://schemas.openxmlformats.org/officeDocument/2006/relationships" xmlns:m="http://schemas.openxmlformats.org/officeDocument/2006/math" xmlns:v="urn:schemas-microsoft-com:vml" xmlns:wp14="http://schemas.microsoft.com/office/word/2010/wordprocessingDrawing" xmlns:wp="http://schemas.openxmlformats.org/drawingml/2006/wordprocessingDrawing" xmlns:w10="urn:schemas-microsoft-com:office:word" xmlns:w="http://schemas.openxmlformats.org/wordprocessingml/2006/main" xmlns:w14="http://schemas.microsoft.com/office/word/2010/wordml" xmlns:w15="http://schemas.microsoft.com/office/word/2012/wordml" xmlns:w16cex="http://schemas.microsoft.com/office/word/2018/wordml/cex" xmlns:w16cid="http://schemas.microsoft.com/office/word/2016/wordml/cid" xmlns:w16="http://schemas.microsoft.com/office/word/2018/wordml" xmlns:w16du="http://schemas.microsoft.com/office/word/2023/wordml/word16du" xmlns:w16sdtdh="http://schemas.microsoft.com/office/word/2020/wordml/sdtdatahash" xmlns:w16sdtfl="http://schemas.microsoft.com/office/word/2024/wordml/sdtformatlock" xmlns:w16se="http://schemas.microsoft.com/office/word/2015/wordml/symex" xmlns:wpg="http://schemas.microsoft.com/office/word/2010/wordprocessingGroup" xmlns:wpi="http://schemas.microsoft.com/office/word/2010/wordprocessingInk" xmlns:wne="http://schemas.microsoft.com/office/word/2006/wordml" xmlns:wps="http://schemas.microsoft.com/office/word/2010/wordprocessingShape" mc:Ignorable="w14 w15 w16se w16cid w16 w16cex w16sdtdh w16sdtfl w16du wp14">
+<w:numbering xmlns:wpc="http://schemas.microsoft.com/office/word/2010/wordprocessingCanvas" xmlns:cx="http://schemas.microsoft.com/office/drawing/2014/chartex" xmlns:cx1="http://schemas.microsoft.com/office/drawing/2015/9/8/chartex" xmlns:cx2="http://schemas.microsoft.com/office/drawing/2015/10/21/chartex" xmlns:cx3="http://schemas.microsoft.com/office/drawing/2016/5/9/chartex" xmlns:cx4="http://schemas.microsoft.com/office/drawing/2016/5/10/chartex" xmlns:cx5="http://schemas.microsoft.com/office/drawing/2016/5/11/chartex" xmlns:cx6="http://schemas.microsoft.com/office/drawing/2016/5/12/chartex" xmlns:cx7="http://schemas.microsoft.com/office/drawing/2016/5/13/chartex" xmlns:cx8="http://schemas.microsoft.com/office/drawing/2016/5/14/chartex" xmlns:mc="http://schemas.openxmlformats.org/markup-compatibility/2006" xmlns:aink="http://schemas.microsoft.com/office/drawing/2016/ink" xmlns:am3d="http://schemas.microsoft.com/office/drawing/2017/model3d" xmlns:o="urn:schemas-microsoft-com:office:office" xmlns:oel="http://schemas.microsoft.com/office/2019/extlst" xmlns:r="http://schemas.openxmlformats.org/officeDocument/2006/relationships" xmlns:m="http://schemas.openxmlformats.org/officeDocument/2006/math" xmlns:v="urn:schemas-microsoft-com:vml" xmlns:wp14="http://schemas.microsoft.com/office/word/2010/wordprocessingDrawing" xmlns:wp="http://schemas.openxmlformats.org/drawingml/2006/wordprocessingDrawing" xmlns:w10="urn:schemas-microsoft-com:office:word" xmlns:w="http://schemas.openxmlformats.org/wordprocessingml/2006/main" xmlns:w14="http://schemas.microsoft.com/office/word/2010/wordml" xmlns:w15="http://schemas.microsoft.com/office/word/2012/wordml" xmlns:w16cex="http://schemas.microsoft.com/office/word/2018/wordml/cex" xmlns:w16cid="http://schemas.microsoft.com/office/word/2016/wordml/cid" xmlns:w16="http://schemas.microsoft.com/office/word/2018/wordml" xmlns:w16du="http://schemas.microsoft.com/office/word/2023/wordml/word16du" xmlns:w16sdtdh="http://schemas.microsoft.com/office/word/2020/wordml/sdtdatahash" xmlns:w16se="http://schemas.microsoft.com/office/word/2015/wordml/symex" xmlns:wpg="http://schemas.microsoft.com/office/word/2010/wordprocessingGroup" xmlns:wpi="http://schemas.microsoft.com/office/word/2010/wordprocessingInk" xmlns:wne="http://schemas.microsoft.com/office/word/2006/wordml" xmlns:wps="http://schemas.microsoft.com/office/word/2010/wordprocessingShape" mc:Ignorable="w14 w15 w16se w16cid w16 w16cex w16sdtdh w16du wp14">
   <w:abstractNum w:abstractNumId="0" w15:restartNumberingAfterBreak="0">
     <w:nsid w:val="0B684134"/>
     <w:multiLevelType w:val="multilevel"/>
@@ -11713,7 +11843,7 @@
 </file>
 
 <file path=word/styles.xml><?xml version="1.0" encoding="utf-8"?>
-<w:styles xmlns:mc="http://schemas.openxmlformats.org/markup-compatibility/2006" xmlns:r="http://schemas.openxmlformats.org/officeDocument/2006/relationships" xmlns:w="http://schemas.openxmlformats.org/wordprocessingml/2006/main" xmlns:w14="http://schemas.microsoft.com/office/word/2010/wordml" xmlns:w15="http://schemas.microsoft.com/office/word/2012/wordml" xmlns:w16cex="http://schemas.microsoft.com/office/word/2018/wordml/cex" xmlns:w16cid="http://schemas.microsoft.com/office/word/2016/wordml/cid" xmlns:w16="http://schemas.microsoft.com/office/word/2018/wordml" xmlns:w16du="http://schemas.microsoft.com/office/word/2023/wordml/word16du" xmlns:w16sdtdh="http://schemas.microsoft.com/office/word/2020/wordml/sdtdatahash" xmlns:w16sdtfl="http://schemas.microsoft.com/office/word/2024/wordml/sdtformatlock" xmlns:w16se="http://schemas.microsoft.com/office/word/2015/wordml/symex" mc:Ignorable="w14 w15 w16se w16cid w16 w16cex w16sdtdh w16sdtfl w16du">
+<w:styles xmlns:mc="http://schemas.openxmlformats.org/markup-compatibility/2006" xmlns:r="http://schemas.openxmlformats.org/officeDocument/2006/relationships" xmlns:w="http://schemas.openxmlformats.org/wordprocessingml/2006/main" xmlns:w14="http://schemas.microsoft.com/office/word/2010/wordml" xmlns:w15="http://schemas.microsoft.com/office/word/2012/wordml" xmlns:w16cex="http://schemas.microsoft.com/office/word/2018/wordml/cex" xmlns:w16cid="http://schemas.microsoft.com/office/word/2016/wordml/cid" xmlns:w16="http://schemas.microsoft.com/office/word/2018/wordml" xmlns:w16du="http://schemas.microsoft.com/office/word/2023/wordml/word16du" xmlns:w16sdtdh="http://schemas.microsoft.com/office/word/2020/wordml/sdtdatahash" xmlns:w16se="http://schemas.microsoft.com/office/word/2015/wordml/symex" mc:Ignorable="w14 w15 w16se w16cid w16 w16cex w16sdtdh w16du">
   <w:docDefaults>
     <w:rPrDefault>
       <w:rPr>

</xml_diff>